<commit_message>
Week 1 Progress of Report
Week 1 : 
1) Introduction to each other.
2) Knowledge about the project.
3) Choose between Research or Development.
</commit_message>
<xml_diff>
--- a/weekly_progress_report_template (1).docx
+++ b/weekly_progress_report_template (1).docx
@@ -1,6 +1,6 @@
 
 <file path=word/document.xml><?xml version="1.0" encoding="utf-8"?>
-<w:document xmlns:wpc="http://schemas.microsoft.com/office/word/2010/wordprocessingCanvas" xmlns:cx="http://schemas.microsoft.com/office/drawing/2014/chartex" xmlns:cx1="http://schemas.microsoft.com/office/drawing/2015/9/8/chartex" xmlns:cx2="http://schemas.microsoft.com/office/drawing/2015/10/21/chartex" xmlns:cx3="http://schemas.microsoft.com/office/drawing/2016/5/9/chartex" xmlns:cx4="http://schemas.microsoft.com/office/drawing/2016/5/10/chartex" xmlns:cx5="http://schemas.microsoft.com/office/drawing/2016/5/11/chartex" xmlns:cx6="http://schemas.microsoft.com/office/drawing/2016/5/12/chartex" xmlns:cx7="http://schemas.microsoft.com/office/drawing/2016/5/13/chartex" xmlns:cx8="http://schemas.microsoft.com/office/drawing/2016/5/14/chartex" xmlns:mc="http://schemas.openxmlformats.org/markup-compatibility/2006" xmlns:aink="http://schemas.microsoft.com/office/drawing/2016/ink" xmlns:am3d="http://schemas.microsoft.com/office/drawing/2017/model3d" xmlns:o="urn:schemas-microsoft-com:office:office" xmlns:oel="http://schemas.microsoft.com/office/2019/extlst" xmlns:r="http://schemas.openxmlformats.org/officeDocument/2006/relationships" xmlns:m="http://schemas.openxmlformats.org/officeDocument/2006/math" xmlns:v="urn:schemas-microsoft-com:vml" xmlns:wp14="http://schemas.microsoft.com/office/word/2010/wordprocessingDrawing" xmlns:wp="http://schemas.openxmlformats.org/drawingml/2006/wordprocessingDrawing" xmlns:w10="urn:schemas-microsoft-com:office:word" xmlns:w="http://schemas.openxmlformats.org/wordprocessingml/2006/main" xmlns:w14="http://schemas.microsoft.com/office/word/2010/wordml" xmlns:w15="http://schemas.microsoft.com/office/word/2012/wordml" xmlns:w16cex="http://schemas.microsoft.com/office/word/2018/wordml/cex" xmlns:w16cid="http://schemas.microsoft.com/office/word/2016/wordml/cid" xmlns:w16="http://schemas.microsoft.com/office/word/2018/wordml" xmlns:w16du="http://schemas.microsoft.com/office/word/2023/wordml/word16du" xmlns:w16sdtdh="http://schemas.microsoft.com/office/word/2020/wordml/sdtdatahash" xmlns:w16sdtfl="http://schemas.microsoft.com/office/word/2024/wordml/sdtformatlock" xmlns:w16se="http://schemas.microsoft.com/office/word/2015/wordml/symex" xmlns:wpg="http://schemas.microsoft.com/office/word/2010/wordprocessingGroup" xmlns:wpi="http://schemas.microsoft.com/office/word/2010/wordprocessingInk" xmlns:wne="http://schemas.microsoft.com/office/word/2006/wordml" xmlns:wps="http://schemas.microsoft.com/office/word/2010/wordprocessingShape" mc:Ignorable="w14 w15 w16se w16cid w16 w16cex w16sdtdh w16sdtfl w16du wp14">
+<w:document xmlns:ve="http://schemas.openxmlformats.org/markup-compatibility/2006" xmlns:o="urn:schemas-microsoft-com:office:office" xmlns:r="http://schemas.openxmlformats.org/officeDocument/2006/relationships" xmlns:m="http://schemas.openxmlformats.org/officeDocument/2006/math" xmlns:v="urn:schemas-microsoft-com:vml" xmlns:wp="http://schemas.openxmlformats.org/drawingml/2006/wordprocessingDrawing" xmlns:w10="urn:schemas-microsoft-com:office:word" xmlns:w="http://schemas.openxmlformats.org/wordprocessingml/2006/main" xmlns:wne="http://schemas.microsoft.com/office/word/2006/wordml">
   <w:body>
     <w:p>
       <w:pPr>
@@ -39,7 +39,7 @@
       <w:tblPr>
         <w:tblStyle w:val="TableGrid"/>
         <w:tblW w:w="9016" w:type="dxa"/>
-        <w:tblLook w:val="04A0" w:firstRow="1" w:lastRow="0" w:firstColumn="1" w:lastColumn="0" w:noHBand="0" w:noVBand="1"/>
+        <w:tblLook w:val="04A0"/>
       </w:tblPr>
       <w:tblGrid>
         <w:gridCol w:w="2689"/>
@@ -78,6 +78,12 @@
                 <w:rFonts w:ascii="Arial" w:hAnsi="Arial" w:cs="Arial"/>
               </w:rPr>
             </w:pPr>
+            <w:r>
+              <w:rPr>
+                <w:rFonts w:ascii="Arial" w:hAnsi="Arial" w:cs="Arial"/>
+              </w:rPr>
+              <w:t>Sabbir</w:t>
+            </w:r>
           </w:p>
         </w:tc>
       </w:tr>
@@ -114,6 +120,12 @@
                 <w:rFonts w:ascii="Arial" w:hAnsi="Arial" w:cs="Arial"/>
               </w:rPr>
             </w:pPr>
+            <w:r>
+              <w:rPr>
+                <w:rFonts w:ascii="Arial" w:hAnsi="Arial" w:cs="Arial"/>
+              </w:rPr>
+              <w:t>Md Fardin Ahmed</w:t>
+            </w:r>
           </w:p>
         </w:tc>
       </w:tr>
@@ -150,6 +162,12 @@
                 <w:rFonts w:ascii="Arial" w:hAnsi="Arial" w:cs="Arial"/>
               </w:rPr>
             </w:pPr>
+            <w:r>
+              <w:rPr>
+                <w:rFonts w:ascii="Arial" w:hAnsi="Arial" w:cs="Arial"/>
+              </w:rPr>
+              <w:t>23293731</w:t>
+            </w:r>
           </w:p>
         </w:tc>
       </w:tr>
@@ -186,6 +204,12 @@
                 <w:rFonts w:ascii="Arial" w:hAnsi="Arial" w:cs="Arial"/>
               </w:rPr>
             </w:pPr>
+            <w:r>
+              <w:rPr>
+                <w:rFonts w:ascii="Arial" w:hAnsi="Arial" w:cs="Arial"/>
+              </w:rPr>
+              <w:t>Cyber Security</w:t>
+            </w:r>
           </w:p>
         </w:tc>
       </w:tr>
@@ -208,12 +232,6 @@
               </w:rPr>
               <w:t>Supervisor</w:t>
             </w:r>
-            <w:r>
-              <w:rPr>
-                <w:rFonts w:ascii="Arial" w:hAnsi="Arial" w:cs="Arial"/>
-              </w:rPr>
-              <w:t xml:space="preserve"> </w:t>
-            </w:r>
           </w:p>
         </w:tc>
         <w:tc>
@@ -228,6 +246,12 @@
                 <w:rFonts w:ascii="Arial" w:hAnsi="Arial" w:cs="Arial"/>
               </w:rPr>
             </w:pPr>
+            <w:r>
+              <w:rPr>
+                <w:rFonts w:ascii="Arial" w:hAnsi="Arial" w:cs="Arial"/>
+              </w:rPr>
+              <w:t>Sajib Mistry</w:t>
+            </w:r>
           </w:p>
         </w:tc>
       </w:tr>
@@ -264,6 +288,12 @@
                 <w:rFonts w:ascii="Arial" w:hAnsi="Arial" w:cs="Arial"/>
               </w:rPr>
             </w:pPr>
+            <w:r>
+              <w:rPr>
+                <w:rFonts w:ascii="Arial" w:hAnsi="Arial" w:cs="Arial"/>
+              </w:rPr>
+              <w:t>Security Automation for Small Businesses (SMBs)</w:t>
+            </w:r>
           </w:p>
         </w:tc>
       </w:tr>
@@ -306,6 +336,12 @@
                 <w:rFonts w:ascii="Arial" w:hAnsi="Arial" w:cs="Arial"/>
               </w:rPr>
             </w:pPr>
+            <w:r>
+              <w:rPr>
+                <w:rFonts w:ascii="Arial" w:hAnsi="Arial" w:cs="Arial"/>
+              </w:rPr>
+              <w:t>5</w:t>
+            </w:r>
           </w:p>
         </w:tc>
       </w:tr>
@@ -358,7 +394,7 @@
                 <w:b/>
                 <w:bCs/>
               </w:rPr>
-              <w:t xml:space="preserve">   </w:t>
+              <w:t>0</w:t>
             </w:r>
             <w:r>
               <w:rPr>
@@ -366,7 +402,7 @@
                 <w:b/>
                 <w:bCs/>
               </w:rPr>
-              <w:t xml:space="preserve"> </w:t>
+              <w:t xml:space="preserve">/ / To / /  </w:t>
             </w:r>
             <w:r>
               <w:rPr>
@@ -374,7 +410,7 @@
                 <w:b/>
                 <w:bCs/>
               </w:rPr>
-              <w:t xml:space="preserve">  </w:t>
+              <w:t>1</w:t>
             </w:r>
             <w:r>
               <w:rPr>
@@ -382,143 +418,7 @@
                 <w:b/>
                 <w:bCs/>
               </w:rPr>
-              <w:t>/</w:t>
-            </w:r>
-            <w:r>
-              <w:rPr>
-                <w:rFonts w:ascii="Arial" w:hAnsi="Arial" w:cs="Arial"/>
-                <w:b/>
-                <w:bCs/>
-              </w:rPr>
-              <w:t xml:space="preserve">   </w:t>
-            </w:r>
-            <w:r>
-              <w:rPr>
-                <w:rFonts w:ascii="Arial" w:hAnsi="Arial" w:cs="Arial"/>
-                <w:b/>
-                <w:bCs/>
-              </w:rPr>
-              <w:t xml:space="preserve">   </w:t>
-            </w:r>
-            <w:r>
-              <w:rPr>
-                <w:rFonts w:ascii="Arial" w:hAnsi="Arial" w:cs="Arial"/>
-                <w:b/>
-                <w:bCs/>
-              </w:rPr>
-              <w:t xml:space="preserve"> </w:t>
-            </w:r>
-            <w:r>
-              <w:rPr>
-                <w:rFonts w:ascii="Arial" w:hAnsi="Arial" w:cs="Arial"/>
-                <w:b/>
-                <w:bCs/>
-              </w:rPr>
-              <w:t xml:space="preserve"> / </w:t>
-            </w:r>
-            <w:r>
-              <w:rPr>
-                <w:rFonts w:ascii="Arial" w:hAnsi="Arial" w:cs="Arial"/>
-                <w:b/>
-                <w:bCs/>
-              </w:rPr>
-              <w:t xml:space="preserve">   </w:t>
-            </w:r>
-            <w:r>
-              <w:rPr>
-                <w:rFonts w:ascii="Arial" w:hAnsi="Arial" w:cs="Arial"/>
-                <w:b/>
-                <w:bCs/>
-              </w:rPr>
-              <w:t xml:space="preserve">   </w:t>
-            </w:r>
-            <w:r>
-              <w:rPr>
-                <w:rFonts w:ascii="Arial" w:hAnsi="Arial" w:cs="Arial"/>
-                <w:b/>
-                <w:bCs/>
-              </w:rPr>
-              <w:t xml:space="preserve"> </w:t>
-            </w:r>
-            <w:r>
-              <w:rPr>
-                <w:rFonts w:ascii="Arial" w:hAnsi="Arial" w:cs="Arial"/>
-                <w:b/>
-                <w:bCs/>
-              </w:rPr>
-              <w:t xml:space="preserve">To </w:t>
-            </w:r>
-            <w:r>
-              <w:rPr>
-                <w:rFonts w:ascii="Arial" w:hAnsi="Arial" w:cs="Arial"/>
-                <w:b/>
-                <w:bCs/>
-              </w:rPr>
-              <w:t xml:space="preserve">    </w:t>
-            </w:r>
-            <w:r>
-              <w:rPr>
-                <w:rFonts w:ascii="Arial" w:hAnsi="Arial" w:cs="Arial"/>
-                <w:b/>
-                <w:bCs/>
-              </w:rPr>
-              <w:t xml:space="preserve"> </w:t>
-            </w:r>
-            <w:r>
-              <w:rPr>
-                <w:rFonts w:ascii="Arial" w:hAnsi="Arial" w:cs="Arial"/>
-                <w:b/>
-                <w:bCs/>
-              </w:rPr>
-              <w:t xml:space="preserve">  </w:t>
-            </w:r>
-            <w:r>
-              <w:rPr>
-                <w:rFonts w:ascii="Arial" w:hAnsi="Arial" w:cs="Arial"/>
-                <w:b/>
-                <w:bCs/>
-              </w:rPr>
-              <w:t xml:space="preserve">  </w:t>
-            </w:r>
-            <w:r>
-              <w:rPr>
-                <w:rFonts w:ascii="Arial" w:hAnsi="Arial" w:cs="Arial"/>
-                <w:b/>
-                <w:bCs/>
-              </w:rPr>
-              <w:t>/</w:t>
-            </w:r>
-            <w:r>
-              <w:rPr>
-                <w:rFonts w:ascii="Arial" w:hAnsi="Arial" w:cs="Arial"/>
-                <w:b/>
-                <w:bCs/>
-              </w:rPr>
-              <w:t xml:space="preserve">   </w:t>
-            </w:r>
-            <w:r>
-              <w:rPr>
-                <w:rFonts w:ascii="Arial" w:hAnsi="Arial" w:cs="Arial"/>
-                <w:b/>
-                <w:bCs/>
-              </w:rPr>
-              <w:t xml:space="preserve">  </w:t>
-            </w:r>
-            <w:r>
-              <w:rPr>
-                <w:rFonts w:ascii="Arial" w:hAnsi="Arial" w:cs="Arial"/>
-                <w:b/>
-                <w:bCs/>
-              </w:rPr>
-              <w:t xml:space="preserve">    </w:t>
-            </w:r>
-            <w:r>
-              <w:rPr>
-                <w:rFonts w:ascii="Arial" w:hAnsi="Arial" w:cs="Arial"/>
-                <w:b/>
-                <w:bCs/>
-              </w:rPr>
-              <w:t xml:space="preserve"> /           </w:t>
+              <w:t xml:space="preserve">         </w:t>
             </w:r>
           </w:p>
         </w:tc>
@@ -552,7 +452,7 @@
       <w:tblPr>
         <w:tblStyle w:val="TableGrid"/>
         <w:tblW w:w="9015" w:type="dxa"/>
-        <w:tblLook w:val="04A0" w:firstRow="1" w:lastRow="0" w:firstColumn="1" w:lastColumn="0" w:noHBand="0" w:noVBand="1"/>
+        <w:tblLook w:val="04A0"/>
       </w:tblPr>
       <w:tblGrid>
         <w:gridCol w:w="1803"/>
@@ -712,6 +612,12 @@
                 <w:rFonts w:ascii="Arial" w:hAnsi="Arial" w:cs="Arial"/>
               </w:rPr>
             </w:pPr>
+            <w:r>
+              <w:rPr>
+                <w:rFonts w:ascii="Arial" w:hAnsi="Arial" w:cs="Arial"/>
+              </w:rPr>
+              <w:t>yes</w:t>
+            </w:r>
           </w:p>
         </w:tc>
         <w:tc>
@@ -767,32 +673,14 @@
           <w:i/>
           <w:iCs/>
         </w:rPr>
-        <w:t xml:space="preserve">Breakdown of the time spent on the project for this reporting week (add more rows if needed). If you are part of a team, be specific to what you </w:t>
-      </w:r>
-      <w:proofErr w:type="gramStart"/>
-      <w:r>
-        <w:rPr>
-          <w:rFonts w:ascii="Arial" w:hAnsi="Arial" w:cs="Arial"/>
-          <w:i/>
-          <w:iCs/>
-        </w:rPr>
-        <w:t>actually did</w:t>
-      </w:r>
-      <w:proofErr w:type="gramEnd"/>
-      <w:r>
-        <w:rPr>
-          <w:rFonts w:ascii="Arial" w:hAnsi="Arial" w:cs="Arial"/>
-          <w:i/>
-          <w:iCs/>
-        </w:rPr>
-        <w:t>.</w:t>
+        <w:t>Breakdown of the time spent on the project for this reporting week (add more rows if needed). If you are part of a team, be specific to what you actually did.</w:t>
       </w:r>
     </w:p>
     <w:tbl>
       <w:tblPr>
         <w:tblStyle w:val="TableGrid"/>
         <w:tblW w:w="9016" w:type="dxa"/>
-        <w:tblLook w:val="04A0" w:firstRow="1" w:lastRow="0" w:firstColumn="1" w:lastColumn="0" w:noHBand="0" w:noVBand="1"/>
+        <w:tblLook w:val="04A0"/>
       </w:tblPr>
       <w:tblGrid>
         <w:gridCol w:w="6941"/>
@@ -862,6 +750,7 @@
                 <w:rFonts w:ascii="Arial" w:hAnsi="Arial" w:cs="Arial"/>
                 <w:i/>
                 <w:iCs/>
+                <w:color w:val="FF0000"/>
               </w:rPr>
             </w:pPr>
             <w:r>
@@ -871,128 +760,91 @@
                 <w:iCs/>
                 <w:color w:val="FF0000"/>
               </w:rPr>
-              <w:t>Provide detail here</w:t>
-            </w:r>
-          </w:p>
-        </w:tc>
-        <w:tc>
-          <w:tcPr>
-            <w:tcW w:w="2075" w:type="dxa"/>
-            <w:shd w:val="clear" w:color="auto" w:fill="auto"/>
-          </w:tcPr>
-          <w:p>
-            <w:pPr>
-              <w:spacing w:after="0" w:line="240" w:lineRule="auto"/>
-              <w:jc w:val="center"/>
-              <w:rPr>
-                <w:rFonts w:ascii="Arial" w:hAnsi="Arial" w:cs="Arial"/>
-              </w:rPr>
-            </w:pPr>
-          </w:p>
-        </w:tc>
-      </w:tr>
-      <w:tr>
-        <w:tc>
-          <w:tcPr>
-            <w:tcW w:w="6941" w:type="dxa"/>
-            <w:shd w:val="clear" w:color="auto" w:fill="auto"/>
-          </w:tcPr>
-          <w:p>
-            <w:pPr>
-              <w:spacing w:after="0" w:line="240" w:lineRule="auto"/>
-              <w:rPr>
-                <w:rFonts w:ascii="Arial" w:hAnsi="Arial" w:cs="Arial"/>
-              </w:rPr>
-            </w:pPr>
-            <w:r>
+              <w:t xml:space="preserve">Week-1: </w:t>
+            </w:r>
+          </w:p>
+          <w:p>
+            <w:pPr>
+              <w:pStyle w:val="ListParagraph"/>
+              <w:numPr>
+                <w:ilvl w:val="0"/>
+                <w:numId w:val="3"/>
+              </w:numPr>
+              <w:spacing w:after="0" w:line="240" w:lineRule="auto"/>
               <w:rPr>
                 <w:rFonts w:ascii="Arial" w:hAnsi="Arial" w:cs="Arial"/>
                 <w:i/>
                 <w:iCs/>
                 <w:color w:val="FF0000"/>
               </w:rPr>
-              <w:t>Provide detail here</w:t>
-            </w:r>
-          </w:p>
-        </w:tc>
-        <w:tc>
-          <w:tcPr>
-            <w:tcW w:w="2075" w:type="dxa"/>
-            <w:shd w:val="clear" w:color="auto" w:fill="auto"/>
-          </w:tcPr>
-          <w:p>
-            <w:pPr>
-              <w:spacing w:after="0" w:line="240" w:lineRule="auto"/>
-              <w:jc w:val="center"/>
-              <w:rPr>
-                <w:rFonts w:ascii="Arial" w:hAnsi="Arial" w:cs="Arial"/>
-              </w:rPr>
-            </w:pPr>
-          </w:p>
-        </w:tc>
-      </w:tr>
-      <w:tr>
-        <w:tc>
-          <w:tcPr>
-            <w:tcW w:w="6941" w:type="dxa"/>
-            <w:shd w:val="clear" w:color="auto" w:fill="auto"/>
-          </w:tcPr>
-          <w:p>
-            <w:pPr>
-              <w:spacing w:after="0" w:line="240" w:lineRule="auto"/>
-              <w:rPr>
-                <w:rFonts w:ascii="Arial" w:hAnsi="Arial" w:cs="Arial"/>
-              </w:rPr>
-            </w:pPr>
-            <w:r>
+            </w:pPr>
+            <w:r>
+              <w:rPr>
+                <w:rFonts w:ascii="Arial" w:hAnsi="Arial" w:cs="Arial"/>
+                <w:i/>
+                <w:iCs/>
+                <w:color w:val="000000" w:themeColor="text1"/>
+              </w:rPr>
+              <w:t>Introduce Ourselves</w:t>
+            </w:r>
+          </w:p>
+          <w:p>
+            <w:pPr>
+              <w:pStyle w:val="ListParagraph"/>
+              <w:numPr>
+                <w:ilvl w:val="0"/>
+                <w:numId w:val="3"/>
+              </w:numPr>
+              <w:spacing w:after="0" w:line="240" w:lineRule="auto"/>
               <w:rPr>
                 <w:rFonts w:ascii="Arial" w:hAnsi="Arial" w:cs="Arial"/>
                 <w:i/>
                 <w:iCs/>
                 <w:color w:val="FF0000"/>
               </w:rPr>
-              <w:t>Provide detail here</w:t>
-            </w:r>
-          </w:p>
-        </w:tc>
-        <w:tc>
-          <w:tcPr>
-            <w:tcW w:w="2075" w:type="dxa"/>
-            <w:shd w:val="clear" w:color="auto" w:fill="auto"/>
-          </w:tcPr>
-          <w:p>
-            <w:pPr>
-              <w:spacing w:after="0" w:line="240" w:lineRule="auto"/>
-              <w:jc w:val="center"/>
-              <w:rPr>
-                <w:rFonts w:ascii="Arial" w:hAnsi="Arial" w:cs="Arial"/>
-              </w:rPr>
-            </w:pPr>
-          </w:p>
-        </w:tc>
-      </w:tr>
-      <w:tr>
-        <w:tc>
-          <w:tcPr>
-            <w:tcW w:w="6941" w:type="dxa"/>
-            <w:shd w:val="clear" w:color="auto" w:fill="auto"/>
-          </w:tcPr>
-          <w:p>
-            <w:pPr>
-              <w:spacing w:after="0" w:line="240" w:lineRule="auto"/>
-              <w:rPr>
-                <w:rFonts w:ascii="Arial" w:hAnsi="Arial" w:cs="Arial"/>
-              </w:rPr>
-            </w:pPr>
-            <w:r>
+            </w:pPr>
+            <w:r>
+              <w:rPr>
+                <w:rFonts w:ascii="Arial" w:hAnsi="Arial" w:cs="Arial"/>
+                <w:i/>
+                <w:iCs/>
+              </w:rPr>
+              <w:t>Know about the Course</w:t>
+            </w:r>
+          </w:p>
+          <w:p>
+            <w:pPr>
+              <w:pStyle w:val="ListParagraph"/>
+              <w:numPr>
+                <w:ilvl w:val="0"/>
+                <w:numId w:val="3"/>
+              </w:numPr>
+              <w:spacing w:after="0" w:line="240" w:lineRule="auto"/>
               <w:rPr>
                 <w:rFonts w:ascii="Arial" w:hAnsi="Arial" w:cs="Arial"/>
                 <w:i/>
                 <w:iCs/>
                 <w:color w:val="FF0000"/>
               </w:rPr>
-              <w:t>Provide detail here</w:t>
-            </w:r>
+            </w:pPr>
+            <w:r>
+              <w:rPr>
+                <w:rFonts w:ascii="Arial" w:hAnsi="Arial" w:cs="Arial"/>
+                <w:i/>
+                <w:iCs/>
+              </w:rPr>
+              <w:t>Discussion about Research/Development</w:t>
+            </w:r>
+          </w:p>
+          <w:p>
+            <w:pPr>
+              <w:spacing w:after="0" w:line="240" w:lineRule="auto"/>
+              <w:rPr>
+                <w:rFonts w:ascii="Arial" w:hAnsi="Arial" w:cs="Arial"/>
+                <w:i/>
+                <w:iCs/>
+              </w:rPr>
+            </w:pPr>
           </w:p>
         </w:tc>
         <w:tc>
@@ -1008,6 +860,12 @@
                 <w:rFonts w:ascii="Arial" w:hAnsi="Arial" w:cs="Arial"/>
               </w:rPr>
             </w:pPr>
+            <w:r>
+              <w:rPr>
+                <w:rFonts w:ascii="Arial" w:hAnsi="Arial" w:cs="Arial"/>
+              </w:rPr>
+              <w:t>6</w:t>
+            </w:r>
           </w:p>
         </w:tc>
       </w:tr>
@@ -1020,11 +878,79 @@
           <w:p>
             <w:pPr>
               <w:spacing w:after="0" w:line="240" w:lineRule="auto"/>
-              <w:jc w:val="right"/>
+              <w:rPr>
+                <w:rFonts w:ascii="Arial" w:hAnsi="Arial" w:cs="Arial"/>
+              </w:rPr>
+            </w:pPr>
+          </w:p>
+        </w:tc>
+        <w:tc>
+          <w:tcPr>
+            <w:tcW w:w="2075" w:type="dxa"/>
+            <w:shd w:val="clear" w:color="auto" w:fill="auto"/>
+          </w:tcPr>
+          <w:p>
+            <w:pPr>
+              <w:spacing w:after="0" w:line="240" w:lineRule="auto"/>
+              <w:jc w:val="center"/>
+              <w:rPr>
+                <w:rFonts w:ascii="Arial" w:hAnsi="Arial" w:cs="Arial"/>
+              </w:rPr>
+            </w:pPr>
+          </w:p>
+        </w:tc>
+      </w:tr>
+      <w:tr>
+        <w:tc>
+          <w:tcPr>
+            <w:tcW w:w="6941" w:type="dxa"/>
+            <w:shd w:val="clear" w:color="auto" w:fill="auto"/>
+          </w:tcPr>
+          <w:p>
+            <w:pPr>
+              <w:spacing w:after="0" w:line="240" w:lineRule="auto"/>
+              <w:rPr>
+                <w:rFonts w:ascii="Arial" w:hAnsi="Arial" w:cs="Arial"/>
+              </w:rPr>
+            </w:pPr>
+            <w:r>
               <w:rPr>
                 <w:rFonts w:ascii="Arial" w:hAnsi="Arial" w:cs="Arial"/>
                 <w:i/>
                 <w:iCs/>
+                <w:color w:val="FF0000"/>
+              </w:rPr>
+              <w:t>Provide detail here</w:t>
+            </w:r>
+          </w:p>
+        </w:tc>
+        <w:tc>
+          <w:tcPr>
+            <w:tcW w:w="2075" w:type="dxa"/>
+            <w:shd w:val="clear" w:color="auto" w:fill="auto"/>
+          </w:tcPr>
+          <w:p>
+            <w:pPr>
+              <w:spacing w:after="0" w:line="240" w:lineRule="auto"/>
+              <w:jc w:val="center"/>
+              <w:rPr>
+                <w:rFonts w:ascii="Arial" w:hAnsi="Arial" w:cs="Arial"/>
+              </w:rPr>
+            </w:pPr>
+          </w:p>
+        </w:tc>
+      </w:tr>
+      <w:tr>
+        <w:tc>
+          <w:tcPr>
+            <w:tcW w:w="6941" w:type="dxa"/>
+            <w:shd w:val="clear" w:color="auto" w:fill="auto"/>
+          </w:tcPr>
+          <w:p>
+            <w:pPr>
+              <w:spacing w:after="0" w:line="240" w:lineRule="auto"/>
+              <w:rPr>
+                <w:rFonts w:ascii="Arial" w:hAnsi="Arial" w:cs="Arial"/>
               </w:rPr>
             </w:pPr>
             <w:r>
@@ -1032,6 +958,49 @@
                 <w:rFonts w:ascii="Arial" w:hAnsi="Arial" w:cs="Arial"/>
                 <w:i/>
                 <w:iCs/>
+                <w:color w:val="FF0000"/>
+              </w:rPr>
+              <w:t>Provide detail here</w:t>
+            </w:r>
+          </w:p>
+        </w:tc>
+        <w:tc>
+          <w:tcPr>
+            <w:tcW w:w="2075" w:type="dxa"/>
+            <w:shd w:val="clear" w:color="auto" w:fill="auto"/>
+          </w:tcPr>
+          <w:p>
+            <w:pPr>
+              <w:spacing w:after="0" w:line="240" w:lineRule="auto"/>
+              <w:jc w:val="center"/>
+              <w:rPr>
+                <w:rFonts w:ascii="Arial" w:hAnsi="Arial" w:cs="Arial"/>
+              </w:rPr>
+            </w:pPr>
+          </w:p>
+        </w:tc>
+      </w:tr>
+      <w:tr>
+        <w:tc>
+          <w:tcPr>
+            <w:tcW w:w="6941" w:type="dxa"/>
+            <w:shd w:val="clear" w:color="auto" w:fill="auto"/>
+          </w:tcPr>
+          <w:p>
+            <w:pPr>
+              <w:spacing w:after="0" w:line="240" w:lineRule="auto"/>
+              <w:jc w:val="right"/>
+              <w:rPr>
+                <w:rFonts w:ascii="Arial" w:hAnsi="Arial" w:cs="Arial"/>
+                <w:i/>
+                <w:iCs/>
+              </w:rPr>
+            </w:pPr>
+            <w:r>
+              <w:rPr>
+                <w:rFonts w:ascii="Arial" w:hAnsi="Arial" w:cs="Arial"/>
+                <w:i/>
+                <w:iCs/>
               </w:rPr>
               <w:t>TOTAL</w:t>
             </w:r>
@@ -1054,7 +1023,19 @@
               <w:rPr>
                 <w:rFonts w:ascii="Arial" w:hAnsi="Arial" w:cs="Arial"/>
               </w:rPr>
-              <w:t xml:space="preserve">          (hours)</w:t>
+              <w:t xml:space="preserve">        </w:t>
+            </w:r>
+            <w:r>
+              <w:rPr>
+                <w:rFonts w:ascii="Arial" w:hAnsi="Arial" w:cs="Arial"/>
+              </w:rPr>
+              <w:t>6</w:t>
+            </w:r>
+            <w:r>
+              <w:rPr>
+                <w:rFonts w:ascii="Arial" w:hAnsi="Arial" w:cs="Arial"/>
+              </w:rPr>
+              <w:t xml:space="preserve">  (hours)</w:t>
             </w:r>
           </w:p>
         </w:tc>
@@ -1115,6 +1096,18 @@
         </w:rPr>
         <w:t>Highlight 1:</w:t>
       </w:r>
+      <w:r>
+        <w:rPr>
+          <w:rFonts w:ascii="Arial" w:hAnsi="Arial" w:cs="Arial"/>
+        </w:rPr>
+        <w:t xml:space="preserve"> </w:t>
+      </w:r>
+      <w:r>
+        <w:rPr>
+          <w:rFonts w:ascii="Arial" w:hAnsi="Arial" w:cs="Arial"/>
+        </w:rPr>
+        <w:t>Meet group members and know each others.</w:t>
+      </w:r>
     </w:p>
     <w:p>
       <w:pPr>
@@ -1133,6 +1126,18 @@
         </w:rPr>
         <w:t>Highlight 2:</w:t>
       </w:r>
+      <w:r>
+        <w:rPr>
+          <w:rFonts w:ascii="Arial" w:hAnsi="Arial" w:cs="Arial"/>
+        </w:rPr>
+        <w:t xml:space="preserve"> </w:t>
+      </w:r>
+      <w:r>
+        <w:rPr>
+          <w:rFonts w:ascii="Arial" w:hAnsi="Arial" w:cs="Arial"/>
+        </w:rPr>
+        <w:t>Knew about the Course which based on Project.</w:t>
+      </w:r>
     </w:p>
     <w:p>
       <w:pPr>
@@ -1141,8 +1146,12 @@
           <w:ilvl w:val="0"/>
           <w:numId w:val="1"/>
         </w:numPr>
-        <w:rPr>
-          <w:rFonts w:ascii="Arial" w:hAnsi="Arial" w:cs="Arial"/>
+        <w:spacing w:line="360" w:lineRule="auto"/>
+        <w:rPr>
+          <w:rFonts w:ascii="Times New Roman" w:eastAsia="Times New Roman" w:hAnsi="Times New Roman" w:cs="Times New Roman"/>
+          <w:sz w:val="24"/>
+          <w:szCs w:val="24"/>
+          <w:lang w:val="en-US"/>
         </w:rPr>
       </w:pPr>
       <w:r>
@@ -1150,24 +1159,107 @@
           <w:rFonts w:ascii="Arial" w:hAnsi="Arial" w:cs="Arial"/>
         </w:rPr>
         <w:t>Highlight 3:</w:t>
+      </w:r>
+      <w:r>
+        <w:rPr>
+          <w:rFonts w:ascii="Arial" w:hAnsi="Arial" w:cs="Arial"/>
+        </w:rPr>
+        <w:t xml:space="preserve"> </w:t>
+      </w:r>
+      <w:r>
+        <w:rPr>
+          <w:rFonts w:ascii="Arial" w:hAnsi="Arial" w:cs="Arial"/>
+        </w:rPr>
+        <w:t>Made up mind that we are choosing Research over Development.</w:t>
       </w:r>
     </w:p>
     <w:p>
       <w:pPr>
+        <w:pStyle w:val="ListParagraph"/>
+        <w:numPr>
+          <w:ilvl w:val="0"/>
+          <w:numId w:val="1"/>
+        </w:numPr>
+        <w:spacing w:line="360" w:lineRule="auto"/>
+        <w:rPr>
+          <w:rFonts w:ascii="Arial" w:hAnsi="Arial" w:cs="Arial"/>
+          <w:bCs/>
+          <w:sz w:val="24"/>
+          <w:szCs w:val="24"/>
+        </w:rPr>
+      </w:pPr>
+      <w:r>
         <w:rPr>
           <w:rFonts w:ascii="Arial" w:hAnsi="Arial" w:cs="Arial"/>
           <w:b/>
           <w:bCs/>
         </w:rPr>
-      </w:pPr>
+        <w:t>Further detail to report to your supervisor, please include any concerns you may have</w:t>
+      </w:r>
       <w:r>
         <w:rPr>
-          <w:rFonts w:ascii="Arial" w:hAnsi="Arial" w:cs="Arial"/>
+          <w:rFonts w:ascii="Times New Roman" w:hAnsi="Times New Roman" w:cs="Times New Roman"/>
           <w:b/>
           <w:bCs/>
-        </w:rPr>
-        <w:t>Further detail to report to your supervisor, please include any concerns you may have:</w:t>
+          <w:sz w:val="24"/>
+          <w:szCs w:val="24"/>
+        </w:rPr>
+        <w:t xml:space="preserve"> </w:t>
       </w:r>
+      <w:r>
+        <w:rPr>
+          <w:rFonts w:ascii="Arial" w:hAnsi="Arial" w:cs="Arial"/>
+          <w:b/>
+          <w:bCs/>
+        </w:rPr>
+        <w:t>:</w:t>
+      </w:r>
+      <w:r>
+        <w:rPr>
+          <w:rFonts w:ascii="Arial" w:hAnsi="Arial" w:cs="Arial"/>
+          <w:b/>
+          <w:bCs/>
+        </w:rPr>
+        <w:t xml:space="preserve"> </w:t>
+      </w:r>
+      <w:r>
+        <w:rPr>
+          <w:rFonts w:ascii="Arial" w:hAnsi="Arial" w:cs="Arial"/>
+          <w:bCs/>
+          <w:sz w:val="24"/>
+          <w:szCs w:val="24"/>
+        </w:rPr>
+        <w:t>We are group 5 including members of 5. We were confused about to choose the project criteria whether we are going to choose research based project or development project. We finally agreed on research based and successfully choose the topic. We planned the idea over the virtual meting via Google meet. We spent a little lower time in week 1.</w:t>
+      </w:r>
+    </w:p>
+    <w:p>
+      <w:pPr>
+        <w:spacing w:line="360" w:lineRule="auto"/>
+        <w:rPr>
+          <w:rFonts w:ascii="Arial" w:hAnsi="Arial" w:cs="Arial"/>
+          <w:b/>
+          <w:bCs/>
+        </w:rPr>
+      </w:pPr>
+    </w:p>
+    <w:p>
+      <w:pPr>
+        <w:spacing w:line="360" w:lineRule="auto"/>
+        <w:rPr>
+          <w:rFonts w:ascii="Arial" w:hAnsi="Arial" w:cs="Arial"/>
+          <w:b/>
+          <w:bCs/>
+        </w:rPr>
+      </w:pPr>
+    </w:p>
+    <w:p>
+      <w:pPr>
+        <w:rPr>
+          <w:rFonts w:ascii="Arial" w:hAnsi="Arial" w:cs="Arial"/>
+          <w:b/>
+          <w:bCs/>
+        </w:rPr>
+      </w:pPr>
     </w:p>
     <w:p>
       <w:pPr>
@@ -1198,8 +1290,8 @@
 </file>
 
 <file path=word/endnotes.xml><?xml version="1.0" encoding="utf-8"?>
-<w:endnotes xmlns:wpc="http://schemas.microsoft.com/office/word/2010/wordprocessingCanvas" xmlns:cx="http://schemas.microsoft.com/office/drawing/2014/chartex" xmlns:cx1="http://schemas.microsoft.com/office/drawing/2015/9/8/chartex" xmlns:cx2="http://schemas.microsoft.com/office/drawing/2015/10/21/chartex" xmlns:cx3="http://schemas.microsoft.com/office/drawing/2016/5/9/chartex" xmlns:cx4="http://schemas.microsoft.com/office/drawing/2016/5/10/chartex" xmlns:cx5="http://schemas.microsoft.com/office/drawing/2016/5/11/chartex" xmlns:cx6="http://schemas.microsoft.com/office/drawing/2016/5/12/chartex" xmlns:cx7="http://schemas.microsoft.com/office/drawing/2016/5/13/chartex" xmlns:cx8="http://schemas.microsoft.com/office/drawing/2016/5/14/chartex" xmlns:mc="http://schemas.openxmlformats.org/markup-compatibility/2006" xmlns:aink="http://schemas.microsoft.com/office/drawing/2016/ink" xmlns:am3d="http://schemas.microsoft.com/office/drawing/2017/model3d" xmlns:o="urn:schemas-microsoft-com:office:office" xmlns:oel="http://schemas.microsoft.com/office/2019/extlst" xmlns:r="http://schemas.openxmlformats.org/officeDocument/2006/relationships" xmlns:m="http://schemas.openxmlformats.org/officeDocument/2006/math" xmlns:v="urn:schemas-microsoft-com:vml" xmlns:wp14="http://schemas.microsoft.com/office/word/2010/wordprocessingDrawing" xmlns:wp="http://schemas.openxmlformats.org/drawingml/2006/wordprocessingDrawing" xmlns:w10="urn:schemas-microsoft-com:office:word" xmlns:w="http://schemas.openxmlformats.org/wordprocessingml/2006/main" xmlns:w14="http://schemas.microsoft.com/office/word/2010/wordml" xmlns:w15="http://schemas.microsoft.com/office/word/2012/wordml" xmlns:w16cex="http://schemas.microsoft.com/office/word/2018/wordml/cex" xmlns:w16cid="http://schemas.microsoft.com/office/word/2016/wordml/cid" xmlns:w16="http://schemas.microsoft.com/office/word/2018/wordml" xmlns:w16du="http://schemas.microsoft.com/office/word/2023/wordml/word16du" xmlns:w16sdtdh="http://schemas.microsoft.com/office/word/2020/wordml/sdtdatahash" xmlns:w16sdtfl="http://schemas.microsoft.com/office/word/2024/wordml/sdtformatlock" xmlns:w16se="http://schemas.microsoft.com/office/word/2015/wordml/symex" xmlns:wpg="http://schemas.microsoft.com/office/word/2010/wordprocessingGroup" xmlns:wpi="http://schemas.microsoft.com/office/word/2010/wordprocessingInk" xmlns:wne="http://schemas.microsoft.com/office/word/2006/wordml" xmlns:wps="http://schemas.microsoft.com/office/word/2010/wordprocessingShape" mc:Ignorable="w14 w15 w16se w16cid w16 w16cex w16sdtdh w16sdtfl w16du wp14">
-  <w:endnote w:type="separator" w:id="-1">
+<w:endnotes xmlns:ve="http://schemas.openxmlformats.org/markup-compatibility/2006" xmlns:o="urn:schemas-microsoft-com:office:office" xmlns:r="http://schemas.openxmlformats.org/officeDocument/2006/relationships" xmlns:m="http://schemas.openxmlformats.org/officeDocument/2006/math" xmlns:v="urn:schemas-microsoft-com:vml" xmlns:wp="http://schemas.openxmlformats.org/drawingml/2006/wordprocessingDrawing" xmlns:w10="urn:schemas-microsoft-com:office:word" xmlns:w="http://schemas.openxmlformats.org/wordprocessingml/2006/main" xmlns:wne="http://schemas.microsoft.com/office/word/2006/wordml">
+  <w:endnote w:type="separator" w:id="0">
     <w:p>
       <w:pPr>
         <w:spacing w:after="0" w:line="240" w:lineRule="auto"/>
@@ -1209,7 +1301,7 @@
       </w:r>
     </w:p>
   </w:endnote>
-  <w:endnote w:type="continuationSeparator" w:id="0">
+  <w:endnote w:type="continuationSeparator" w:id="1">
     <w:p>
       <w:pPr>
         <w:spacing w:after="0" w:line="240" w:lineRule="auto"/>
@@ -1223,7 +1315,7 @@
 </file>
 
 <file path=word/footer1.xml><?xml version="1.0" encoding="utf-8"?>
-<w:ftr xmlns:wpc="http://schemas.microsoft.com/office/word/2010/wordprocessingCanvas" xmlns:cx="http://schemas.microsoft.com/office/drawing/2014/chartex" xmlns:cx1="http://schemas.microsoft.com/office/drawing/2015/9/8/chartex" xmlns:cx2="http://schemas.microsoft.com/office/drawing/2015/10/21/chartex" xmlns:cx3="http://schemas.microsoft.com/office/drawing/2016/5/9/chartex" xmlns:cx4="http://schemas.microsoft.com/office/drawing/2016/5/10/chartex" xmlns:cx5="http://schemas.microsoft.com/office/drawing/2016/5/11/chartex" xmlns:cx6="http://schemas.microsoft.com/office/drawing/2016/5/12/chartex" xmlns:cx7="http://schemas.microsoft.com/office/drawing/2016/5/13/chartex" xmlns:cx8="http://schemas.microsoft.com/office/drawing/2016/5/14/chartex" xmlns:mc="http://schemas.openxmlformats.org/markup-compatibility/2006" xmlns:aink="http://schemas.microsoft.com/office/drawing/2016/ink" xmlns:am3d="http://schemas.microsoft.com/office/drawing/2017/model3d" xmlns:o="urn:schemas-microsoft-com:office:office" xmlns:oel="http://schemas.microsoft.com/office/2019/extlst" xmlns:r="http://schemas.openxmlformats.org/officeDocument/2006/relationships" xmlns:m="http://schemas.openxmlformats.org/officeDocument/2006/math" xmlns:v="urn:schemas-microsoft-com:vml" xmlns:wp14="http://schemas.microsoft.com/office/word/2010/wordprocessingDrawing" xmlns:wp="http://schemas.openxmlformats.org/drawingml/2006/wordprocessingDrawing" xmlns:w10="urn:schemas-microsoft-com:office:word" xmlns:w="http://schemas.openxmlformats.org/wordprocessingml/2006/main" xmlns:w14="http://schemas.microsoft.com/office/word/2010/wordml" xmlns:w15="http://schemas.microsoft.com/office/word/2012/wordml" xmlns:w16cex="http://schemas.microsoft.com/office/word/2018/wordml/cex" xmlns:w16cid="http://schemas.microsoft.com/office/word/2016/wordml/cid" xmlns:w16="http://schemas.microsoft.com/office/word/2018/wordml" xmlns:w16du="http://schemas.microsoft.com/office/word/2023/wordml/word16du" xmlns:w16sdtdh="http://schemas.microsoft.com/office/word/2020/wordml/sdtdatahash" xmlns:w16sdtfl="http://schemas.microsoft.com/office/word/2024/wordml/sdtformatlock" xmlns:w16se="http://schemas.microsoft.com/office/word/2015/wordml/symex" xmlns:wpg="http://schemas.microsoft.com/office/word/2010/wordprocessingGroup" xmlns:wpi="http://schemas.microsoft.com/office/word/2010/wordprocessingInk" xmlns:wne="http://schemas.microsoft.com/office/word/2006/wordml" xmlns:wps="http://schemas.microsoft.com/office/word/2010/wordprocessingShape" mc:Ignorable="w14 w15 w16se w16cid w16 w16cex w16sdtdh w16sdtfl w16du wp14">
+<w:ftr xmlns:ve="http://schemas.openxmlformats.org/markup-compatibility/2006" xmlns:o="urn:schemas-microsoft-com:office:office" xmlns:r="http://schemas.openxmlformats.org/officeDocument/2006/relationships" xmlns:m="http://schemas.openxmlformats.org/officeDocument/2006/math" xmlns:v="urn:schemas-microsoft-com:vml" xmlns:wp="http://schemas.openxmlformats.org/drawingml/2006/wordprocessingDrawing" xmlns:w10="urn:schemas-microsoft-com:office:word" xmlns:w="http://schemas.openxmlformats.org/wordprocessingml/2006/main" xmlns:wne="http://schemas.microsoft.com/office/word/2006/wordml">
   <w:sdt>
     <w:sdtPr>
       <w:id w:val="825975734"/>
@@ -1246,9 +1338,6 @@
           <w:t>Computer Science Project Weekly Report</w:t>
         </w:r>
         <w:r>
-          <w:t xml:space="preserve">                                                                                                     </w:t>
-        </w:r>
-        <w:r>
           <w:fldChar w:fldCharType="begin"/>
         </w:r>
         <w:r>
@@ -1258,6 +1347,9 @@
           <w:fldChar w:fldCharType="separate"/>
         </w:r>
         <w:r>
+          <w:rPr>
+            <w:noProof/>
+          </w:rPr>
           <w:t>1</w:t>
         </w:r>
         <w:r>
@@ -1275,8 +1367,8 @@
 </file>
 
 <file path=word/footnotes.xml><?xml version="1.0" encoding="utf-8"?>
-<w:footnotes xmlns:wpc="http://schemas.microsoft.com/office/word/2010/wordprocessingCanvas" xmlns:cx="http://schemas.microsoft.com/office/drawing/2014/chartex" xmlns:cx1="http://schemas.microsoft.com/office/drawing/2015/9/8/chartex" xmlns:cx2="http://schemas.microsoft.com/office/drawing/2015/10/21/chartex" xmlns:cx3="http://schemas.microsoft.com/office/drawing/2016/5/9/chartex" xmlns:cx4="http://schemas.microsoft.com/office/drawing/2016/5/10/chartex" xmlns:cx5="http://schemas.microsoft.com/office/drawing/2016/5/11/chartex" xmlns:cx6="http://schemas.microsoft.com/office/drawing/2016/5/12/chartex" xmlns:cx7="http://schemas.microsoft.com/office/drawing/2016/5/13/chartex" xmlns:cx8="http://schemas.microsoft.com/office/drawing/2016/5/14/chartex" xmlns:mc="http://schemas.openxmlformats.org/markup-compatibility/2006" xmlns:aink="http://schemas.microsoft.com/office/drawing/2016/ink" xmlns:am3d="http://schemas.microsoft.com/office/drawing/2017/model3d" xmlns:o="urn:schemas-microsoft-com:office:office" xmlns:oel="http://schemas.microsoft.com/office/2019/extlst" xmlns:r="http://schemas.openxmlformats.org/officeDocument/2006/relationships" xmlns:m="http://schemas.openxmlformats.org/officeDocument/2006/math" xmlns:v="urn:schemas-microsoft-com:vml" xmlns:wp14="http://schemas.microsoft.com/office/word/2010/wordprocessingDrawing" xmlns:wp="http://schemas.openxmlformats.org/drawingml/2006/wordprocessingDrawing" xmlns:w10="urn:schemas-microsoft-com:office:word" xmlns:w="http://schemas.openxmlformats.org/wordprocessingml/2006/main" xmlns:w14="http://schemas.microsoft.com/office/word/2010/wordml" xmlns:w15="http://schemas.microsoft.com/office/word/2012/wordml" xmlns:w16cex="http://schemas.microsoft.com/office/word/2018/wordml/cex" xmlns:w16cid="http://schemas.microsoft.com/office/word/2016/wordml/cid" xmlns:w16="http://schemas.microsoft.com/office/word/2018/wordml" xmlns:w16du="http://schemas.microsoft.com/office/word/2023/wordml/word16du" xmlns:w16sdtdh="http://schemas.microsoft.com/office/word/2020/wordml/sdtdatahash" xmlns:w16sdtfl="http://schemas.microsoft.com/office/word/2024/wordml/sdtformatlock" xmlns:w16se="http://schemas.microsoft.com/office/word/2015/wordml/symex" xmlns:wpg="http://schemas.microsoft.com/office/word/2010/wordprocessingGroup" xmlns:wpi="http://schemas.microsoft.com/office/word/2010/wordprocessingInk" xmlns:wne="http://schemas.microsoft.com/office/word/2006/wordml" xmlns:wps="http://schemas.microsoft.com/office/word/2010/wordprocessingShape" mc:Ignorable="w14 w15 w16se w16cid w16 w16cex w16sdtdh w16sdtfl w16du wp14">
-  <w:footnote w:type="separator" w:id="-1">
+<w:footnotes xmlns:ve="http://schemas.openxmlformats.org/markup-compatibility/2006" xmlns:o="urn:schemas-microsoft-com:office:office" xmlns:r="http://schemas.openxmlformats.org/officeDocument/2006/relationships" xmlns:m="http://schemas.openxmlformats.org/officeDocument/2006/math" xmlns:v="urn:schemas-microsoft-com:vml" xmlns:wp="http://schemas.openxmlformats.org/drawingml/2006/wordprocessingDrawing" xmlns:w10="urn:schemas-microsoft-com:office:word" xmlns:w="http://schemas.openxmlformats.org/wordprocessingml/2006/main" xmlns:wne="http://schemas.microsoft.com/office/word/2006/wordml">
+  <w:footnote w:type="separator" w:id="0">
     <w:p>
       <w:pPr>
         <w:spacing w:after="0" w:line="240" w:lineRule="auto"/>
@@ -1286,7 +1378,7 @@
       </w:r>
     </w:p>
   </w:footnote>
-  <w:footnote w:type="continuationSeparator" w:id="0">
+  <w:footnote w:type="continuationSeparator" w:id="1">
     <w:p>
       <w:pPr>
         <w:spacing w:after="0" w:line="240" w:lineRule="auto"/>
@@ -1300,8 +1392,8 @@
 </file>
 
 <file path=word/numbering.xml><?xml version="1.0" encoding="utf-8"?>
-<w:numbering xmlns:wpc="http://schemas.microsoft.com/office/word/2010/wordprocessingCanvas" xmlns:cx="http://schemas.microsoft.com/office/drawing/2014/chartex" xmlns:cx1="http://schemas.microsoft.com/office/drawing/2015/9/8/chartex" xmlns:cx2="http://schemas.microsoft.com/office/drawing/2015/10/21/chartex" xmlns:cx3="http://schemas.microsoft.com/office/drawing/2016/5/9/chartex" xmlns:cx4="http://schemas.microsoft.com/office/drawing/2016/5/10/chartex" xmlns:cx5="http://schemas.microsoft.com/office/drawing/2016/5/11/chartex" xmlns:cx6="http://schemas.microsoft.com/office/drawing/2016/5/12/chartex" xmlns:cx7="http://schemas.microsoft.com/office/drawing/2016/5/13/chartex" xmlns:cx8="http://schemas.microsoft.com/office/drawing/2016/5/14/chartex" xmlns:mc="http://schemas.openxmlformats.org/markup-compatibility/2006" xmlns:aink="http://schemas.microsoft.com/office/drawing/2016/ink" xmlns:am3d="http://schemas.microsoft.com/office/drawing/2017/model3d" xmlns:o="urn:schemas-microsoft-com:office:office" xmlns:oel="http://schemas.microsoft.com/office/2019/extlst" xmlns:r="http://schemas.openxmlformats.org/officeDocument/2006/relationships" xmlns:m="http://schemas.openxmlformats.org/officeDocument/2006/math" xmlns:v="urn:schemas-microsoft-com:vml" xmlns:wp14="http://schemas.microsoft.com/office/word/2010/wordprocessingDrawing" xmlns:wp="http://schemas.openxmlformats.org/drawingml/2006/wordprocessingDrawing" xmlns:w10="urn:schemas-microsoft-com:office:word" xmlns:w="http://schemas.openxmlformats.org/wordprocessingml/2006/main" xmlns:w14="http://schemas.microsoft.com/office/word/2010/wordml" xmlns:w15="http://schemas.microsoft.com/office/word/2012/wordml" xmlns:w16cex="http://schemas.microsoft.com/office/word/2018/wordml/cex" xmlns:w16cid="http://schemas.microsoft.com/office/word/2016/wordml/cid" xmlns:w16="http://schemas.microsoft.com/office/word/2018/wordml" xmlns:w16du="http://schemas.microsoft.com/office/word/2023/wordml/word16du" xmlns:w16sdtdh="http://schemas.microsoft.com/office/word/2020/wordml/sdtdatahash" xmlns:w16sdtfl="http://schemas.microsoft.com/office/word/2024/wordml/sdtformatlock" xmlns:w16se="http://schemas.microsoft.com/office/word/2015/wordml/symex" xmlns:wpg="http://schemas.microsoft.com/office/word/2010/wordprocessingGroup" xmlns:wpi="http://schemas.microsoft.com/office/word/2010/wordprocessingInk" xmlns:wne="http://schemas.microsoft.com/office/word/2006/wordml" xmlns:wps="http://schemas.microsoft.com/office/word/2010/wordprocessingShape" mc:Ignorable="w14 w15 w16se w16cid w16 w16cex w16sdtdh w16sdtfl w16du wp14">
-  <w:abstractNum w:abstractNumId="0" w15:restartNumberingAfterBreak="0">
+<w:numbering xmlns:ve="http://schemas.openxmlformats.org/markup-compatibility/2006" xmlns:o="urn:schemas-microsoft-com:office:office" xmlns:r="http://schemas.openxmlformats.org/officeDocument/2006/relationships" xmlns:m="http://schemas.openxmlformats.org/officeDocument/2006/math" xmlns:v="urn:schemas-microsoft-com:vml" xmlns:wp="http://schemas.openxmlformats.org/drawingml/2006/wordprocessingDrawing" xmlns:w10="urn:schemas-microsoft-com:office:word" xmlns:w="http://schemas.openxmlformats.org/wordprocessingml/2006/main" xmlns:wne="http://schemas.microsoft.com/office/word/2006/wordml">
+  <w:abstractNum w:abstractNumId="0">
     <w:nsid w:val="0ADE18A9"/>
     <w:multiLevelType w:val="multilevel"/>
     <w:tmpl w:val="73E827C6"/>
@@ -1414,7 +1506,233 @@
       </w:rPr>
     </w:lvl>
   </w:abstractNum>
-  <w:abstractNum w:abstractNumId="1" w15:restartNumberingAfterBreak="0">
+  <w:abstractNum w:abstractNumId="1">
+    <w:nsid w:val="237612C5"/>
+    <w:multiLevelType w:val="hybridMultilevel"/>
+    <w:tmpl w:val="A594ABB2"/>
+    <w:lvl w:ilvl="0" w:tplc="04090001">
+      <w:start w:val="1"/>
+      <w:numFmt w:val="bullet"/>
+      <w:lvlText w:val=""/>
+      <w:lvlJc w:val="left"/>
+      <w:pPr>
+        <w:ind w:left="720" w:hanging="360"/>
+      </w:pPr>
+      <w:rPr>
+        <w:rFonts w:ascii="Symbol" w:hAnsi="Symbol" w:hint="default"/>
+      </w:rPr>
+    </w:lvl>
+    <w:lvl w:ilvl="1" w:tplc="04090003" w:tentative="1">
+      <w:start w:val="1"/>
+      <w:numFmt w:val="bullet"/>
+      <w:lvlText w:val="o"/>
+      <w:lvlJc w:val="left"/>
+      <w:pPr>
+        <w:ind w:left="1440" w:hanging="360"/>
+      </w:pPr>
+      <w:rPr>
+        <w:rFonts w:ascii="Courier New" w:hAnsi="Courier New" w:cs="Courier New" w:hint="default"/>
+      </w:rPr>
+    </w:lvl>
+    <w:lvl w:ilvl="2" w:tplc="04090005" w:tentative="1">
+      <w:start w:val="1"/>
+      <w:numFmt w:val="bullet"/>
+      <w:lvlText w:val=""/>
+      <w:lvlJc w:val="left"/>
+      <w:pPr>
+        <w:ind w:left="2160" w:hanging="360"/>
+      </w:pPr>
+      <w:rPr>
+        <w:rFonts w:ascii="Wingdings" w:hAnsi="Wingdings" w:hint="default"/>
+      </w:rPr>
+    </w:lvl>
+    <w:lvl w:ilvl="3" w:tplc="04090001" w:tentative="1">
+      <w:start w:val="1"/>
+      <w:numFmt w:val="bullet"/>
+      <w:lvlText w:val=""/>
+      <w:lvlJc w:val="left"/>
+      <w:pPr>
+        <w:ind w:left="2880" w:hanging="360"/>
+      </w:pPr>
+      <w:rPr>
+        <w:rFonts w:ascii="Symbol" w:hAnsi="Symbol" w:hint="default"/>
+      </w:rPr>
+    </w:lvl>
+    <w:lvl w:ilvl="4" w:tplc="04090003" w:tentative="1">
+      <w:start w:val="1"/>
+      <w:numFmt w:val="bullet"/>
+      <w:lvlText w:val="o"/>
+      <w:lvlJc w:val="left"/>
+      <w:pPr>
+        <w:ind w:left="3600" w:hanging="360"/>
+      </w:pPr>
+      <w:rPr>
+        <w:rFonts w:ascii="Courier New" w:hAnsi="Courier New" w:cs="Courier New" w:hint="default"/>
+      </w:rPr>
+    </w:lvl>
+    <w:lvl w:ilvl="5" w:tplc="04090005" w:tentative="1">
+      <w:start w:val="1"/>
+      <w:numFmt w:val="bullet"/>
+      <w:lvlText w:val=""/>
+      <w:lvlJc w:val="left"/>
+      <w:pPr>
+        <w:ind w:left="4320" w:hanging="360"/>
+      </w:pPr>
+      <w:rPr>
+        <w:rFonts w:ascii="Wingdings" w:hAnsi="Wingdings" w:hint="default"/>
+      </w:rPr>
+    </w:lvl>
+    <w:lvl w:ilvl="6" w:tplc="04090001" w:tentative="1">
+      <w:start w:val="1"/>
+      <w:numFmt w:val="bullet"/>
+      <w:lvlText w:val=""/>
+      <w:lvlJc w:val="left"/>
+      <w:pPr>
+        <w:ind w:left="5040" w:hanging="360"/>
+      </w:pPr>
+      <w:rPr>
+        <w:rFonts w:ascii="Symbol" w:hAnsi="Symbol" w:hint="default"/>
+      </w:rPr>
+    </w:lvl>
+    <w:lvl w:ilvl="7" w:tplc="04090003" w:tentative="1">
+      <w:start w:val="1"/>
+      <w:numFmt w:val="bullet"/>
+      <w:lvlText w:val="o"/>
+      <w:lvlJc w:val="left"/>
+      <w:pPr>
+        <w:ind w:left="5760" w:hanging="360"/>
+      </w:pPr>
+      <w:rPr>
+        <w:rFonts w:ascii="Courier New" w:hAnsi="Courier New" w:cs="Courier New" w:hint="default"/>
+      </w:rPr>
+    </w:lvl>
+    <w:lvl w:ilvl="8" w:tplc="04090005" w:tentative="1">
+      <w:start w:val="1"/>
+      <w:numFmt w:val="bullet"/>
+      <w:lvlText w:val=""/>
+      <w:lvlJc w:val="left"/>
+      <w:pPr>
+        <w:ind w:left="6480" w:hanging="360"/>
+      </w:pPr>
+      <w:rPr>
+        <w:rFonts w:ascii="Wingdings" w:hAnsi="Wingdings" w:hint="default"/>
+      </w:rPr>
+    </w:lvl>
+  </w:abstractNum>
+  <w:abstractNum w:abstractNumId="2">
+    <w:nsid w:val="45E23BFF"/>
+    <w:multiLevelType w:val="hybridMultilevel"/>
+    <w:tmpl w:val="DA466EAC"/>
+    <w:lvl w:ilvl="0" w:tplc="04090001">
+      <w:start w:val="1"/>
+      <w:numFmt w:val="bullet"/>
+      <w:lvlText w:val=""/>
+      <w:lvlJc w:val="left"/>
+      <w:pPr>
+        <w:ind w:left="768" w:hanging="360"/>
+      </w:pPr>
+      <w:rPr>
+        <w:rFonts w:ascii="Symbol" w:hAnsi="Symbol" w:hint="default"/>
+      </w:rPr>
+    </w:lvl>
+    <w:lvl w:ilvl="1" w:tplc="04090003" w:tentative="1">
+      <w:start w:val="1"/>
+      <w:numFmt w:val="bullet"/>
+      <w:lvlText w:val="o"/>
+      <w:lvlJc w:val="left"/>
+      <w:pPr>
+        <w:ind w:left="1488" w:hanging="360"/>
+      </w:pPr>
+      <w:rPr>
+        <w:rFonts w:ascii="Courier New" w:hAnsi="Courier New" w:cs="Courier New" w:hint="default"/>
+      </w:rPr>
+    </w:lvl>
+    <w:lvl w:ilvl="2" w:tplc="04090005" w:tentative="1">
+      <w:start w:val="1"/>
+      <w:numFmt w:val="bullet"/>
+      <w:lvlText w:val=""/>
+      <w:lvlJc w:val="left"/>
+      <w:pPr>
+        <w:ind w:left="2208" w:hanging="360"/>
+      </w:pPr>
+      <w:rPr>
+        <w:rFonts w:ascii="Wingdings" w:hAnsi="Wingdings" w:hint="default"/>
+      </w:rPr>
+    </w:lvl>
+    <w:lvl w:ilvl="3" w:tplc="04090001" w:tentative="1">
+      <w:start w:val="1"/>
+      <w:numFmt w:val="bullet"/>
+      <w:lvlText w:val=""/>
+      <w:lvlJc w:val="left"/>
+      <w:pPr>
+        <w:ind w:left="2928" w:hanging="360"/>
+      </w:pPr>
+      <w:rPr>
+        <w:rFonts w:ascii="Symbol" w:hAnsi="Symbol" w:hint="default"/>
+      </w:rPr>
+    </w:lvl>
+    <w:lvl w:ilvl="4" w:tplc="04090003" w:tentative="1">
+      <w:start w:val="1"/>
+      <w:numFmt w:val="bullet"/>
+      <w:lvlText w:val="o"/>
+      <w:lvlJc w:val="left"/>
+      <w:pPr>
+        <w:ind w:left="3648" w:hanging="360"/>
+      </w:pPr>
+      <w:rPr>
+        <w:rFonts w:ascii="Courier New" w:hAnsi="Courier New" w:cs="Courier New" w:hint="default"/>
+      </w:rPr>
+    </w:lvl>
+    <w:lvl w:ilvl="5" w:tplc="04090005" w:tentative="1">
+      <w:start w:val="1"/>
+      <w:numFmt w:val="bullet"/>
+      <w:lvlText w:val=""/>
+      <w:lvlJc w:val="left"/>
+      <w:pPr>
+        <w:ind w:left="4368" w:hanging="360"/>
+      </w:pPr>
+      <w:rPr>
+        <w:rFonts w:ascii="Wingdings" w:hAnsi="Wingdings" w:hint="default"/>
+      </w:rPr>
+    </w:lvl>
+    <w:lvl w:ilvl="6" w:tplc="04090001" w:tentative="1">
+      <w:start w:val="1"/>
+      <w:numFmt w:val="bullet"/>
+      <w:lvlText w:val=""/>
+      <w:lvlJc w:val="left"/>
+      <w:pPr>
+        <w:ind w:left="5088" w:hanging="360"/>
+      </w:pPr>
+      <w:rPr>
+        <w:rFonts w:ascii="Symbol" w:hAnsi="Symbol" w:hint="default"/>
+      </w:rPr>
+    </w:lvl>
+    <w:lvl w:ilvl="7" w:tplc="04090003" w:tentative="1">
+      <w:start w:val="1"/>
+      <w:numFmt w:val="bullet"/>
+      <w:lvlText w:val="o"/>
+      <w:lvlJc w:val="left"/>
+      <w:pPr>
+        <w:ind w:left="5808" w:hanging="360"/>
+      </w:pPr>
+      <w:rPr>
+        <w:rFonts w:ascii="Courier New" w:hAnsi="Courier New" w:cs="Courier New" w:hint="default"/>
+      </w:rPr>
+    </w:lvl>
+    <w:lvl w:ilvl="8" w:tplc="04090005" w:tentative="1">
+      <w:start w:val="1"/>
+      <w:numFmt w:val="bullet"/>
+      <w:lvlText w:val=""/>
+      <w:lvlJc w:val="left"/>
+      <w:pPr>
+        <w:ind w:left="6528" w:hanging="360"/>
+      </w:pPr>
+      <w:rPr>
+        <w:rFonts w:ascii="Wingdings" w:hAnsi="Wingdings" w:hint="default"/>
+      </w:rPr>
+    </w:lvl>
+  </w:abstractNum>
+  <w:abstractNum w:abstractNumId="3">
     <w:nsid w:val="4AD108AA"/>
     <w:multiLevelType w:val="multilevel"/>
     <w:tmpl w:val="0CFC9CDC"/>
@@ -1509,17 +1827,23 @@
       </w:pPr>
     </w:lvl>
   </w:abstractNum>
-  <w:num w:numId="1" w16cid:durableId="14045196">
+  <w:num w:numId="1">
     <w:abstractNumId w:val="0"/>
   </w:num>
-  <w:num w:numId="2" w16cid:durableId="904878765">
+  <w:num w:numId="2">
+    <w:abstractNumId w:val="3"/>
+  </w:num>
+  <w:num w:numId="3">
     <w:abstractNumId w:val="1"/>
+  </w:num>
+  <w:num w:numId="4">
+    <w:abstractNumId w:val="2"/>
   </w:num>
 </w:numbering>
 </file>
 
 <file path=word/styles.xml><?xml version="1.0" encoding="utf-8"?>
-<w:styles xmlns:mc="http://schemas.openxmlformats.org/markup-compatibility/2006" xmlns:r="http://schemas.openxmlformats.org/officeDocument/2006/relationships" xmlns:w="http://schemas.openxmlformats.org/wordprocessingml/2006/main" xmlns:w14="http://schemas.microsoft.com/office/word/2010/wordml" xmlns:w15="http://schemas.microsoft.com/office/word/2012/wordml" xmlns:w16cex="http://schemas.microsoft.com/office/word/2018/wordml/cex" xmlns:w16cid="http://schemas.microsoft.com/office/word/2016/wordml/cid" xmlns:w16="http://schemas.microsoft.com/office/word/2018/wordml" xmlns:w16du="http://schemas.microsoft.com/office/word/2023/wordml/word16du" xmlns:w16sdtdh="http://schemas.microsoft.com/office/word/2020/wordml/sdtdatahash" xmlns:w16sdtfl="http://schemas.microsoft.com/office/word/2024/wordml/sdtformatlock" xmlns:w16se="http://schemas.microsoft.com/office/word/2015/wordml/symex" mc:Ignorable="w14 w15 w16se w16cid w16 w16cex w16sdtdh w16sdtfl w16du">
+<w:styles xmlns:r="http://schemas.openxmlformats.org/officeDocument/2006/relationships" xmlns:w="http://schemas.openxmlformats.org/wordprocessingml/2006/main">
   <w:docDefaults>
     <w:rPrDefault>
       <w:rPr>
@@ -1531,387 +1855,149 @@
     </w:rPrDefault>
     <w:pPrDefault/>
   </w:docDefaults>
-  <w:latentStyles w:defLockedState="0" w:defUIPriority="99" w:defSemiHidden="0" w:defUnhideWhenUsed="0" w:defQFormat="0" w:count="376">
-    <w:lsdException w:name="Normal" w:uiPriority="0" w:qFormat="1"/>
-    <w:lsdException w:name="heading 1" w:uiPriority="9" w:qFormat="1"/>
-    <w:lsdException w:name="heading 2" w:semiHidden="1" w:uiPriority="9" w:unhideWhenUsed="1" w:qFormat="1"/>
-    <w:lsdException w:name="heading 3" w:semiHidden="1" w:uiPriority="9" w:unhideWhenUsed="1" w:qFormat="1"/>
-    <w:lsdException w:name="heading 4" w:semiHidden="1" w:uiPriority="9" w:unhideWhenUsed="1" w:qFormat="1"/>
-    <w:lsdException w:name="heading 5" w:semiHidden="1" w:uiPriority="9" w:unhideWhenUsed="1" w:qFormat="1"/>
-    <w:lsdException w:name="heading 6" w:semiHidden="1" w:uiPriority="9" w:unhideWhenUsed="1" w:qFormat="1"/>
-    <w:lsdException w:name="heading 7" w:semiHidden="1" w:uiPriority="9" w:unhideWhenUsed="1" w:qFormat="1"/>
-    <w:lsdException w:name="heading 8" w:semiHidden="1" w:uiPriority="9" w:unhideWhenUsed="1" w:qFormat="1"/>
-    <w:lsdException w:name="heading 9" w:semiHidden="1" w:uiPriority="9" w:unhideWhenUsed="1" w:qFormat="1"/>
-    <w:lsdException w:name="index 1" w:semiHidden="1" w:unhideWhenUsed="1"/>
-    <w:lsdException w:name="index 2" w:semiHidden="1" w:unhideWhenUsed="1"/>
-    <w:lsdException w:name="index 3" w:semiHidden="1" w:unhideWhenUsed="1"/>
-    <w:lsdException w:name="index 4" w:semiHidden="1" w:unhideWhenUsed="1"/>
-    <w:lsdException w:name="index 5" w:semiHidden="1" w:unhideWhenUsed="1"/>
-    <w:lsdException w:name="index 6" w:semiHidden="1" w:unhideWhenUsed="1"/>
-    <w:lsdException w:name="index 7" w:semiHidden="1" w:unhideWhenUsed="1"/>
-    <w:lsdException w:name="index 8" w:semiHidden="1" w:unhideWhenUsed="1"/>
-    <w:lsdException w:name="index 9" w:semiHidden="1" w:unhideWhenUsed="1"/>
-    <w:lsdException w:name="toc 1" w:semiHidden="1" w:uiPriority="39" w:unhideWhenUsed="1"/>
-    <w:lsdException w:name="toc 2" w:semiHidden="1" w:uiPriority="39" w:unhideWhenUsed="1"/>
-    <w:lsdException w:name="toc 3" w:semiHidden="1" w:uiPriority="39" w:unhideWhenUsed="1"/>
-    <w:lsdException w:name="toc 4" w:semiHidden="1" w:uiPriority="39" w:unhideWhenUsed="1"/>
-    <w:lsdException w:name="toc 5" w:semiHidden="1" w:uiPriority="39" w:unhideWhenUsed="1"/>
-    <w:lsdException w:name="toc 6" w:semiHidden="1" w:uiPriority="39" w:unhideWhenUsed="1"/>
-    <w:lsdException w:name="toc 7" w:semiHidden="1" w:uiPriority="39" w:unhideWhenUsed="1"/>
-    <w:lsdException w:name="toc 8" w:semiHidden="1" w:uiPriority="39" w:unhideWhenUsed="1"/>
-    <w:lsdException w:name="toc 9" w:semiHidden="1" w:uiPriority="39" w:unhideWhenUsed="1"/>
-    <w:lsdException w:name="Normal Indent" w:semiHidden="1" w:unhideWhenUsed="1"/>
-    <w:lsdException w:name="footnote text" w:semiHidden="1" w:unhideWhenUsed="1"/>
-    <w:lsdException w:name="annotation text" w:semiHidden="1" w:unhideWhenUsed="1"/>
-    <w:lsdException w:name="header" w:semiHidden="1" w:unhideWhenUsed="1"/>
-    <w:lsdException w:name="footer" w:semiHidden="1" w:unhideWhenUsed="1"/>
-    <w:lsdException w:name="index heading" w:semiHidden="1" w:unhideWhenUsed="1"/>
-    <w:lsdException w:name="caption" w:semiHidden="1" w:uiPriority="35" w:unhideWhenUsed="1" w:qFormat="1"/>
-    <w:lsdException w:name="table of figures" w:semiHidden="1" w:unhideWhenUsed="1"/>
-    <w:lsdException w:name="envelope address" w:semiHidden="1" w:unhideWhenUsed="1"/>
-    <w:lsdException w:name="envelope return" w:semiHidden="1" w:unhideWhenUsed="1"/>
-    <w:lsdException w:name="footnote reference" w:semiHidden="1" w:unhideWhenUsed="1"/>
-    <w:lsdException w:name="annotation reference" w:semiHidden="1" w:unhideWhenUsed="1"/>
-    <w:lsdException w:name="line number" w:semiHidden="1" w:unhideWhenUsed="1"/>
-    <w:lsdException w:name="page number" w:semiHidden="1" w:unhideWhenUsed="1"/>
-    <w:lsdException w:name="endnote reference" w:semiHidden="1" w:unhideWhenUsed="1"/>
-    <w:lsdException w:name="endnote text" w:semiHidden="1" w:unhideWhenUsed="1"/>
-    <w:lsdException w:name="table of authorities" w:semiHidden="1" w:unhideWhenUsed="1"/>
-    <w:lsdException w:name="macro" w:semiHidden="1" w:unhideWhenUsed="1"/>
-    <w:lsdException w:name="toa heading" w:semiHidden="1" w:unhideWhenUsed="1"/>
-    <w:lsdException w:name="List" w:semiHidden="1" w:unhideWhenUsed="1"/>
-    <w:lsdException w:name="List Bullet" w:semiHidden="1" w:unhideWhenUsed="1"/>
-    <w:lsdException w:name="List Number" w:semiHidden="1" w:unhideWhenUsed="1"/>
-    <w:lsdException w:name="List 2" w:semiHidden="1" w:unhideWhenUsed="1"/>
-    <w:lsdException w:name="List 3" w:semiHidden="1" w:unhideWhenUsed="1"/>
-    <w:lsdException w:name="List 4" w:semiHidden="1" w:unhideWhenUsed="1"/>
-    <w:lsdException w:name="List 5" w:semiHidden="1" w:unhideWhenUsed="1"/>
-    <w:lsdException w:name="List Bullet 2" w:semiHidden="1" w:unhideWhenUsed="1"/>
-    <w:lsdException w:name="List Bullet 3" w:semiHidden="1" w:unhideWhenUsed="1"/>
-    <w:lsdException w:name="List Bullet 4" w:semiHidden="1" w:unhideWhenUsed="1"/>
-    <w:lsdException w:name="List Bullet 5" w:semiHidden="1" w:unhideWhenUsed="1"/>
-    <w:lsdException w:name="List Number 2" w:semiHidden="1" w:unhideWhenUsed="1"/>
-    <w:lsdException w:name="List Number 3" w:semiHidden="1" w:unhideWhenUsed="1"/>
-    <w:lsdException w:name="List Number 4" w:semiHidden="1" w:unhideWhenUsed="1"/>
-    <w:lsdException w:name="List Number 5" w:semiHidden="1" w:unhideWhenUsed="1"/>
-    <w:lsdException w:name="Title" w:uiPriority="10" w:qFormat="1"/>
-    <w:lsdException w:name="Closing" w:semiHidden="1" w:unhideWhenUsed="1"/>
-    <w:lsdException w:name="Signature" w:semiHidden="1" w:unhideWhenUsed="1"/>
-    <w:lsdException w:name="Default Paragraph Font" w:semiHidden="1" w:uiPriority="1" w:unhideWhenUsed="1"/>
-    <w:lsdException w:name="Body Text" w:semiHidden="1" w:unhideWhenUsed="1"/>
-    <w:lsdException w:name="Body Text Indent" w:semiHidden="1" w:unhideWhenUsed="1"/>
-    <w:lsdException w:name="List Continue" w:semiHidden="1" w:unhideWhenUsed="1"/>
-    <w:lsdException w:name="List Continue 2" w:semiHidden="1" w:unhideWhenUsed="1"/>
-    <w:lsdException w:name="List Continue 3" w:semiHidden="1" w:unhideWhenUsed="1"/>
-    <w:lsdException w:name="List Continue 4" w:semiHidden="1" w:unhideWhenUsed="1"/>
-    <w:lsdException w:name="List Continue 5" w:semiHidden="1" w:unhideWhenUsed="1"/>
-    <w:lsdException w:name="Message Header" w:semiHidden="1" w:unhideWhenUsed="1"/>
-    <w:lsdException w:name="Subtitle" w:uiPriority="11" w:qFormat="1"/>
-    <w:lsdException w:name="Salutation" w:semiHidden="1" w:unhideWhenUsed="1"/>
-    <w:lsdException w:name="Date" w:semiHidden="1" w:unhideWhenUsed="1"/>
-    <w:lsdException w:name="Body Text First Indent" w:semiHidden="1" w:unhideWhenUsed="1"/>
-    <w:lsdException w:name="Body Text First Indent 2" w:semiHidden="1" w:unhideWhenUsed="1"/>
-    <w:lsdException w:name="Note Heading" w:semiHidden="1" w:unhideWhenUsed="1"/>
-    <w:lsdException w:name="Body Text 2" w:semiHidden="1" w:unhideWhenUsed="1"/>
-    <w:lsdException w:name="Body Text 3" w:semiHidden="1" w:unhideWhenUsed="1"/>
-    <w:lsdException w:name="Body Text Indent 2" w:semiHidden="1" w:unhideWhenUsed="1"/>
-    <w:lsdException w:name="Body Text Indent 3" w:semiHidden="1" w:unhideWhenUsed="1"/>
-    <w:lsdException w:name="Block Text" w:semiHidden="1" w:unhideWhenUsed="1"/>
-    <w:lsdException w:name="Hyperlink" w:semiHidden="1" w:unhideWhenUsed="1"/>
-    <w:lsdException w:name="FollowedHyperlink" w:semiHidden="1" w:unhideWhenUsed="1"/>
-    <w:lsdException w:name="Strong" w:uiPriority="22" w:qFormat="1"/>
-    <w:lsdException w:name="Emphasis" w:uiPriority="20" w:qFormat="1"/>
-    <w:lsdException w:name="Document Map" w:semiHidden="1" w:unhideWhenUsed="1"/>
-    <w:lsdException w:name="Plain Text" w:semiHidden="1" w:unhideWhenUsed="1"/>
-    <w:lsdException w:name="E-mail Signature" w:semiHidden="1" w:unhideWhenUsed="1"/>
-    <w:lsdException w:name="HTML Top of Form" w:semiHidden="1" w:unhideWhenUsed="1"/>
-    <w:lsdException w:name="HTML Bottom of Form" w:semiHidden="1" w:unhideWhenUsed="1"/>
-    <w:lsdException w:name="Normal (Web)" w:semiHidden="1" w:unhideWhenUsed="1"/>
-    <w:lsdException w:name="HTML Acronym" w:semiHidden="1" w:unhideWhenUsed="1"/>
-    <w:lsdException w:name="HTML Address" w:semiHidden="1" w:unhideWhenUsed="1"/>
-    <w:lsdException w:name="HTML Cite" w:semiHidden="1" w:unhideWhenUsed="1"/>
-    <w:lsdException w:name="HTML Code" w:semiHidden="1" w:unhideWhenUsed="1"/>
-    <w:lsdException w:name="HTML Definition" w:semiHidden="1" w:unhideWhenUsed="1"/>
-    <w:lsdException w:name="HTML Keyboard" w:semiHidden="1" w:unhideWhenUsed="1"/>
-    <w:lsdException w:name="HTML Preformatted" w:semiHidden="1" w:unhideWhenUsed="1"/>
-    <w:lsdException w:name="HTML Sample" w:semiHidden="1" w:unhideWhenUsed="1"/>
-    <w:lsdException w:name="HTML Typewriter" w:semiHidden="1" w:unhideWhenUsed="1"/>
-    <w:lsdException w:name="HTML Variable" w:semiHidden="1" w:unhideWhenUsed="1"/>
-    <w:lsdException w:name="Normal Table" w:semiHidden="1" w:unhideWhenUsed="1"/>
-    <w:lsdException w:name="annotation subject" w:semiHidden="1" w:unhideWhenUsed="1"/>
-    <w:lsdException w:name="No List" w:semiHidden="1" w:unhideWhenUsed="1"/>
-    <w:lsdException w:name="Outline List 1" w:semiHidden="1" w:unhideWhenUsed="1"/>
-    <w:lsdException w:name="Outline List 2" w:semiHidden="1" w:unhideWhenUsed="1"/>
-    <w:lsdException w:name="Outline List 3" w:semiHidden="1" w:unhideWhenUsed="1"/>
-    <w:lsdException w:name="Table Simple 1" w:semiHidden="1" w:unhideWhenUsed="1"/>
-    <w:lsdException w:name="Table Simple 2" w:semiHidden="1" w:unhideWhenUsed="1"/>
-    <w:lsdException w:name="Table Simple 3" w:semiHidden="1" w:unhideWhenUsed="1"/>
-    <w:lsdException w:name="Table Classic 1" w:semiHidden="1" w:unhideWhenUsed="1"/>
-    <w:lsdException w:name="Table Classic 2" w:semiHidden="1" w:unhideWhenUsed="1"/>
-    <w:lsdException w:name="Table Classic 3" w:semiHidden="1" w:unhideWhenUsed="1"/>
-    <w:lsdException w:name="Table Classic 4" w:semiHidden="1" w:unhideWhenUsed="1"/>
-    <w:lsdException w:name="Table Colorful 1" w:semiHidden="1" w:unhideWhenUsed="1"/>
-    <w:lsdException w:name="Table Colorful 2" w:semiHidden="1" w:unhideWhenUsed="1"/>
-    <w:lsdException w:name="Table Colorful 3" w:semiHidden="1" w:unhideWhenUsed="1"/>
-    <w:lsdException w:name="Table Columns 1" w:semiHidden="1" w:unhideWhenUsed="1"/>
-    <w:lsdException w:name="Table Columns 2" w:semiHidden="1" w:unhideWhenUsed="1"/>
-    <w:lsdException w:name="Table Columns 3" w:semiHidden="1" w:unhideWhenUsed="1"/>
-    <w:lsdException w:name="Table Columns 4" w:semiHidden="1" w:unhideWhenUsed="1"/>
-    <w:lsdException w:name="Table Columns 5" w:semiHidden="1" w:unhideWhenUsed="1"/>
-    <w:lsdException w:name="Table Grid 1" w:semiHidden="1" w:unhideWhenUsed="1"/>
-    <w:lsdException w:name="Table Grid 2" w:semiHidden="1" w:unhideWhenUsed="1"/>
-    <w:lsdException w:name="Table Grid 3" w:semiHidden="1" w:unhideWhenUsed="1"/>
-    <w:lsdException w:name="Table Grid 4" w:semiHidden="1" w:unhideWhenUsed="1"/>
-    <w:lsdException w:name="Table Grid 5" w:semiHidden="1" w:unhideWhenUsed="1"/>
-    <w:lsdException w:name="Table Grid 6" w:semiHidden="1" w:unhideWhenUsed="1"/>
-    <w:lsdException w:name="Table Grid 7" w:semiHidden="1" w:unhideWhenUsed="1"/>
-    <w:lsdException w:name="Table Grid 8" w:semiHidden="1" w:unhideWhenUsed="1"/>
-    <w:lsdException w:name="Table List 1" w:semiHidden="1" w:unhideWhenUsed="1"/>
-    <w:lsdException w:name="Table List 2" w:semiHidden="1" w:unhideWhenUsed="1"/>
-    <w:lsdException w:name="Table List 3" w:semiHidden="1" w:unhideWhenUsed="1"/>
-    <w:lsdException w:name="Table List 4" w:semiHidden="1" w:unhideWhenUsed="1"/>
-    <w:lsdException w:name="Table List 5" w:semiHidden="1" w:unhideWhenUsed="1"/>
-    <w:lsdException w:name="Table List 6" w:semiHidden="1" w:unhideWhenUsed="1"/>
-    <w:lsdException w:name="Table List 7" w:semiHidden="1" w:unhideWhenUsed="1"/>
-    <w:lsdException w:name="Table List 8" w:semiHidden="1" w:unhideWhenUsed="1"/>
-    <w:lsdException w:name="Table 3D effects 1" w:semiHidden="1" w:unhideWhenUsed="1"/>
-    <w:lsdException w:name="Table 3D effects 2" w:semiHidden="1" w:unhideWhenUsed="1"/>
-    <w:lsdException w:name="Table 3D effects 3" w:semiHidden="1" w:unhideWhenUsed="1"/>
-    <w:lsdException w:name="Table Contemporary" w:semiHidden="1" w:unhideWhenUsed="1"/>
-    <w:lsdException w:name="Table Elegant" w:semiHidden="1" w:unhideWhenUsed="1"/>
-    <w:lsdException w:name="Table Professional" w:semiHidden="1" w:unhideWhenUsed="1"/>
-    <w:lsdException w:name="Table Subtle 1" w:semiHidden="1" w:unhideWhenUsed="1"/>
-    <w:lsdException w:name="Table Subtle 2" w:semiHidden="1" w:unhideWhenUsed="1"/>
-    <w:lsdException w:name="Table Web 1" w:semiHidden="1" w:unhideWhenUsed="1"/>
-    <w:lsdException w:name="Table Web 2" w:semiHidden="1" w:unhideWhenUsed="1"/>
-    <w:lsdException w:name="Table Web 3" w:semiHidden="1" w:unhideWhenUsed="1"/>
-    <w:lsdException w:name="Balloon Text" w:semiHidden="1" w:unhideWhenUsed="1"/>
-    <w:lsdException w:name="Table Grid" w:uiPriority="39"/>
-    <w:lsdException w:name="Table Theme" w:semiHidden="1" w:unhideWhenUsed="1"/>
-    <w:lsdException w:name="Placeholder Text" w:semiHidden="1"/>
-    <w:lsdException w:name="No Spacing" w:uiPriority="1" w:qFormat="1"/>
-    <w:lsdException w:name="Light Shading" w:uiPriority="60"/>
-    <w:lsdException w:name="Light List" w:uiPriority="61"/>
-    <w:lsdException w:name="Light Grid" w:uiPriority="62"/>
-    <w:lsdException w:name="Medium Shading 1" w:uiPriority="63"/>
-    <w:lsdException w:name="Medium Shading 2" w:uiPriority="64"/>
-    <w:lsdException w:name="Medium List 1" w:uiPriority="65"/>
-    <w:lsdException w:name="Medium List 2" w:uiPriority="66"/>
-    <w:lsdException w:name="Medium Grid 1" w:uiPriority="67"/>
-    <w:lsdException w:name="Medium Grid 2" w:uiPriority="68"/>
-    <w:lsdException w:name="Medium Grid 3" w:uiPriority="69"/>
-    <w:lsdException w:name="Dark List" w:uiPriority="70"/>
-    <w:lsdException w:name="Colorful Shading" w:uiPriority="71"/>
-    <w:lsdException w:name="Colorful List" w:uiPriority="72"/>
-    <w:lsdException w:name="Colorful Grid" w:uiPriority="73"/>
-    <w:lsdException w:name="Light Shading Accent 1" w:uiPriority="60"/>
-    <w:lsdException w:name="Light List Accent 1" w:uiPriority="61"/>
-    <w:lsdException w:name="Light Grid Accent 1" w:uiPriority="62"/>
-    <w:lsdException w:name="Medium Shading 1 Accent 1" w:uiPriority="63"/>
-    <w:lsdException w:name="Medium Shading 2 Accent 1" w:uiPriority="64"/>
-    <w:lsdException w:name="Medium List 1 Accent 1" w:uiPriority="65"/>
-    <w:lsdException w:name="Revision" w:semiHidden="1"/>
-    <w:lsdException w:name="List Paragraph" w:uiPriority="34" w:qFormat="1"/>
-    <w:lsdException w:name="Quote" w:uiPriority="29" w:qFormat="1"/>
-    <w:lsdException w:name="Intense Quote" w:uiPriority="30" w:qFormat="1"/>
-    <w:lsdException w:name="Medium List 2 Accent 1" w:uiPriority="66"/>
-    <w:lsdException w:name="Medium Grid 1 Accent 1" w:uiPriority="67"/>
-    <w:lsdException w:name="Medium Grid 2 Accent 1" w:uiPriority="68"/>
-    <w:lsdException w:name="Medium Grid 3 Accent 1" w:uiPriority="69"/>
-    <w:lsdException w:name="Dark List Accent 1" w:uiPriority="70"/>
-    <w:lsdException w:name="Colorful Shading Accent 1" w:uiPriority="71"/>
-    <w:lsdException w:name="Colorful List Accent 1" w:uiPriority="72"/>
-    <w:lsdException w:name="Colorful Grid Accent 1" w:uiPriority="73"/>
-    <w:lsdException w:name="Light Shading Accent 2" w:uiPriority="60"/>
-    <w:lsdException w:name="Light List Accent 2" w:uiPriority="61"/>
-    <w:lsdException w:name="Light Grid Accent 2" w:uiPriority="62"/>
-    <w:lsdException w:name="Medium Shading 1 Accent 2" w:uiPriority="63"/>
-    <w:lsdException w:name="Medium Shading 2 Accent 2" w:uiPriority="64"/>
-    <w:lsdException w:name="Medium List 1 Accent 2" w:uiPriority="65"/>
-    <w:lsdException w:name="Medium List 2 Accent 2" w:uiPriority="66"/>
-    <w:lsdException w:name="Medium Grid 1 Accent 2" w:uiPriority="67"/>
-    <w:lsdException w:name="Medium Grid 2 Accent 2" w:uiPriority="68"/>
-    <w:lsdException w:name="Medium Grid 3 Accent 2" w:uiPriority="69"/>
-    <w:lsdException w:name="Dark List Accent 2" w:uiPriority="70"/>
-    <w:lsdException w:name="Colorful Shading Accent 2" w:uiPriority="71"/>
-    <w:lsdException w:name="Colorful List Accent 2" w:uiPriority="72"/>
-    <w:lsdException w:name="Colorful Grid Accent 2" w:uiPriority="73"/>
-    <w:lsdException w:name="Light Shading Accent 3" w:uiPriority="60"/>
-    <w:lsdException w:name="Light List Accent 3" w:uiPriority="61"/>
-    <w:lsdException w:name="Light Grid Accent 3" w:uiPriority="62"/>
-    <w:lsdException w:name="Medium Shading 1 Accent 3" w:uiPriority="63"/>
-    <w:lsdException w:name="Medium Shading 2 Accent 3" w:uiPriority="64"/>
-    <w:lsdException w:name="Medium List 1 Accent 3" w:uiPriority="65"/>
-    <w:lsdException w:name="Medium List 2 Accent 3" w:uiPriority="66"/>
-    <w:lsdException w:name="Medium Grid 1 Accent 3" w:uiPriority="67"/>
-    <w:lsdException w:name="Medium Grid 2 Accent 3" w:uiPriority="68"/>
-    <w:lsdException w:name="Medium Grid 3 Accent 3" w:uiPriority="69"/>
-    <w:lsdException w:name="Dark List Accent 3" w:uiPriority="70"/>
-    <w:lsdException w:name="Colorful Shading Accent 3" w:uiPriority="71"/>
-    <w:lsdException w:name="Colorful List Accent 3" w:uiPriority="72"/>
-    <w:lsdException w:name="Colorful Grid Accent 3" w:uiPriority="73"/>
-    <w:lsdException w:name="Light Shading Accent 4" w:uiPriority="60"/>
-    <w:lsdException w:name="Light List Accent 4" w:uiPriority="61"/>
-    <w:lsdException w:name="Light Grid Accent 4" w:uiPriority="62"/>
-    <w:lsdException w:name="Medium Shading 1 Accent 4" w:uiPriority="63"/>
-    <w:lsdException w:name="Medium Shading 2 Accent 4" w:uiPriority="64"/>
-    <w:lsdException w:name="Medium List 1 Accent 4" w:uiPriority="65"/>
-    <w:lsdException w:name="Medium List 2 Accent 4" w:uiPriority="66"/>
-    <w:lsdException w:name="Medium Grid 1 Accent 4" w:uiPriority="67"/>
-    <w:lsdException w:name="Medium Grid 2 Accent 4" w:uiPriority="68"/>
-    <w:lsdException w:name="Medium Grid 3 Accent 4" w:uiPriority="69"/>
-    <w:lsdException w:name="Dark List Accent 4" w:uiPriority="70"/>
-    <w:lsdException w:name="Colorful Shading Accent 4" w:uiPriority="71"/>
-    <w:lsdException w:name="Colorful List Accent 4" w:uiPriority="72"/>
-    <w:lsdException w:name="Colorful Grid Accent 4" w:uiPriority="73"/>
-    <w:lsdException w:name="Light Shading Accent 5" w:uiPriority="60"/>
-    <w:lsdException w:name="Light List Accent 5" w:uiPriority="61"/>
-    <w:lsdException w:name="Light Grid Accent 5" w:uiPriority="62"/>
-    <w:lsdException w:name="Medium Shading 1 Accent 5" w:uiPriority="63"/>
-    <w:lsdException w:name="Medium Shading 2 Accent 5" w:uiPriority="64"/>
-    <w:lsdException w:name="Medium List 1 Accent 5" w:uiPriority="65"/>
-    <w:lsdException w:name="Medium List 2 Accent 5" w:uiPriority="66"/>
-    <w:lsdException w:name="Medium Grid 1 Accent 5" w:uiPriority="67"/>
-    <w:lsdException w:name="Medium Grid 2 Accent 5" w:uiPriority="68"/>
-    <w:lsdException w:name="Medium Grid 3 Accent 5" w:uiPriority="69"/>
-    <w:lsdException w:name="Dark List Accent 5" w:uiPriority="70"/>
-    <w:lsdException w:name="Colorful Shading Accent 5" w:uiPriority="71"/>
-    <w:lsdException w:name="Colorful List Accent 5" w:uiPriority="72"/>
-    <w:lsdException w:name="Colorful Grid Accent 5" w:uiPriority="73"/>
-    <w:lsdException w:name="Light Shading Accent 6" w:uiPriority="60"/>
-    <w:lsdException w:name="Light List Accent 6" w:uiPriority="61"/>
-    <w:lsdException w:name="Light Grid Accent 6" w:uiPriority="62"/>
-    <w:lsdException w:name="Medium Shading 1 Accent 6" w:uiPriority="63"/>
-    <w:lsdException w:name="Medium Shading 2 Accent 6" w:uiPriority="64"/>
-    <w:lsdException w:name="Medium List 1 Accent 6" w:uiPriority="65"/>
-    <w:lsdException w:name="Medium List 2 Accent 6" w:uiPriority="66"/>
-    <w:lsdException w:name="Medium Grid 1 Accent 6" w:uiPriority="67"/>
-    <w:lsdException w:name="Medium Grid 2 Accent 6" w:uiPriority="68"/>
-    <w:lsdException w:name="Medium Grid 3 Accent 6" w:uiPriority="69"/>
-    <w:lsdException w:name="Dark List Accent 6" w:uiPriority="70"/>
-    <w:lsdException w:name="Colorful Shading Accent 6" w:uiPriority="71"/>
-    <w:lsdException w:name="Colorful List Accent 6" w:uiPriority="72"/>
-    <w:lsdException w:name="Colorful Grid Accent 6" w:uiPriority="73"/>
-    <w:lsdException w:name="Subtle Emphasis" w:uiPriority="19" w:qFormat="1"/>
-    <w:lsdException w:name="Intense Emphasis" w:uiPriority="21" w:qFormat="1"/>
-    <w:lsdException w:name="Subtle Reference" w:uiPriority="31" w:qFormat="1"/>
-    <w:lsdException w:name="Intense Reference" w:uiPriority="32" w:qFormat="1"/>
-    <w:lsdException w:name="Book Title" w:uiPriority="33" w:qFormat="1"/>
-    <w:lsdException w:name="Bibliography" w:semiHidden="1" w:uiPriority="37" w:unhideWhenUsed="1"/>
-    <w:lsdException w:name="TOC Heading" w:semiHidden="1" w:uiPriority="39" w:unhideWhenUsed="1" w:qFormat="1"/>
-    <w:lsdException w:name="Plain Table 1" w:uiPriority="41"/>
-    <w:lsdException w:name="Plain Table 2" w:uiPriority="42"/>
-    <w:lsdException w:name="Plain Table 3" w:uiPriority="43"/>
-    <w:lsdException w:name="Plain Table 4" w:uiPriority="44"/>
-    <w:lsdException w:name="Plain Table 5" w:uiPriority="45"/>
-    <w:lsdException w:name="Grid Table Light" w:uiPriority="40"/>
-    <w:lsdException w:name="Grid Table 1 Light" w:uiPriority="46"/>
-    <w:lsdException w:name="Grid Table 2" w:uiPriority="47"/>
-    <w:lsdException w:name="Grid Table 3" w:uiPriority="48"/>
-    <w:lsdException w:name="Grid Table 4" w:uiPriority="49"/>
-    <w:lsdException w:name="Grid Table 5 Dark" w:uiPriority="50"/>
-    <w:lsdException w:name="Grid Table 6 Colorful" w:uiPriority="51"/>
-    <w:lsdException w:name="Grid Table 7 Colorful" w:uiPriority="52"/>
-    <w:lsdException w:name="Grid Table 1 Light Accent 1" w:uiPriority="46"/>
-    <w:lsdException w:name="Grid Table 2 Accent 1" w:uiPriority="47"/>
-    <w:lsdException w:name="Grid Table 3 Accent 1" w:uiPriority="48"/>
-    <w:lsdException w:name="Grid Table 4 Accent 1" w:uiPriority="49"/>
-    <w:lsdException w:name="Grid Table 5 Dark Accent 1" w:uiPriority="50"/>
-    <w:lsdException w:name="Grid Table 6 Colorful Accent 1" w:uiPriority="51"/>
-    <w:lsdException w:name="Grid Table 7 Colorful Accent 1" w:uiPriority="52"/>
-    <w:lsdException w:name="Grid Table 1 Light Accent 2" w:uiPriority="46"/>
-    <w:lsdException w:name="Grid Table 2 Accent 2" w:uiPriority="47"/>
-    <w:lsdException w:name="Grid Table 3 Accent 2" w:uiPriority="48"/>
-    <w:lsdException w:name="Grid Table 4 Accent 2" w:uiPriority="49"/>
-    <w:lsdException w:name="Grid Table 5 Dark Accent 2" w:uiPriority="50"/>
-    <w:lsdException w:name="Grid Table 6 Colorful Accent 2" w:uiPriority="51"/>
-    <w:lsdException w:name="Grid Table 7 Colorful Accent 2" w:uiPriority="52"/>
-    <w:lsdException w:name="Grid Table 1 Light Accent 3" w:uiPriority="46"/>
-    <w:lsdException w:name="Grid Table 2 Accent 3" w:uiPriority="47"/>
-    <w:lsdException w:name="Grid Table 3 Accent 3" w:uiPriority="48"/>
-    <w:lsdException w:name="Grid Table 4 Accent 3" w:uiPriority="49"/>
-    <w:lsdException w:name="Grid Table 5 Dark Accent 3" w:uiPriority="50"/>
-    <w:lsdException w:name="Grid Table 6 Colorful Accent 3" w:uiPriority="51"/>
-    <w:lsdException w:name="Grid Table 7 Colorful Accent 3" w:uiPriority="52"/>
-    <w:lsdException w:name="Grid Table 1 Light Accent 4" w:uiPriority="46"/>
-    <w:lsdException w:name="Grid Table 2 Accent 4" w:uiPriority="47"/>
-    <w:lsdException w:name="Grid Table 3 Accent 4" w:uiPriority="48"/>
-    <w:lsdException w:name="Grid Table 4 Accent 4" w:uiPriority="49"/>
-    <w:lsdException w:name="Grid Table 5 Dark Accent 4" w:uiPriority="50"/>
-    <w:lsdException w:name="Grid Table 6 Colorful Accent 4" w:uiPriority="51"/>
-    <w:lsdException w:name="Grid Table 7 Colorful Accent 4" w:uiPriority="52"/>
-    <w:lsdException w:name="Grid Table 1 Light Accent 5" w:uiPriority="46"/>
-    <w:lsdException w:name="Grid Table 2 Accent 5" w:uiPriority="47"/>
-    <w:lsdException w:name="Grid Table 3 Accent 5" w:uiPriority="48"/>
-    <w:lsdException w:name="Grid Table 4 Accent 5" w:uiPriority="49"/>
-    <w:lsdException w:name="Grid Table 5 Dark Accent 5" w:uiPriority="50"/>
-    <w:lsdException w:name="Grid Table 6 Colorful Accent 5" w:uiPriority="51"/>
-    <w:lsdException w:name="Grid Table 7 Colorful Accent 5" w:uiPriority="52"/>
-    <w:lsdException w:name="Grid Table 1 Light Accent 6" w:uiPriority="46"/>
-    <w:lsdException w:name="Grid Table 2 Accent 6" w:uiPriority="47"/>
-    <w:lsdException w:name="Grid Table 3 Accent 6" w:uiPriority="48"/>
-    <w:lsdException w:name="Grid Table 4 Accent 6" w:uiPriority="49"/>
-    <w:lsdException w:name="Grid Table 5 Dark Accent 6" w:uiPriority="50"/>
-    <w:lsdException w:name="Grid Table 6 Colorful Accent 6" w:uiPriority="51"/>
-    <w:lsdException w:name="Grid Table 7 Colorful Accent 6" w:uiPriority="52"/>
-    <w:lsdException w:name="List Table 1 Light" w:uiPriority="46"/>
-    <w:lsdException w:name="List Table 2" w:uiPriority="47"/>
-    <w:lsdException w:name="List Table 3" w:uiPriority="48"/>
-    <w:lsdException w:name="List Table 4" w:uiPriority="49"/>
-    <w:lsdException w:name="List Table 5 Dark" w:uiPriority="50"/>
-    <w:lsdException w:name="List Table 6 Colorful" w:uiPriority="51"/>
-    <w:lsdException w:name="List Table 7 Colorful" w:uiPriority="52"/>
-    <w:lsdException w:name="List Table 1 Light Accent 1" w:uiPriority="46"/>
-    <w:lsdException w:name="List Table 2 Accent 1" w:uiPriority="47"/>
-    <w:lsdException w:name="List Table 3 Accent 1" w:uiPriority="48"/>
-    <w:lsdException w:name="List Table 4 Accent 1" w:uiPriority="49"/>
-    <w:lsdException w:name="List Table 5 Dark Accent 1" w:uiPriority="50"/>
-    <w:lsdException w:name="List Table 6 Colorful Accent 1" w:uiPriority="51"/>
-    <w:lsdException w:name="List Table 7 Colorful Accent 1" w:uiPriority="52"/>
-    <w:lsdException w:name="List Table 1 Light Accent 2" w:uiPriority="46"/>
-    <w:lsdException w:name="List Table 2 Accent 2" w:uiPriority="47"/>
-    <w:lsdException w:name="List Table 3 Accent 2" w:uiPriority="48"/>
-    <w:lsdException w:name="List Table 4 Accent 2" w:uiPriority="49"/>
-    <w:lsdException w:name="List Table 5 Dark Accent 2" w:uiPriority="50"/>
-    <w:lsdException w:name="List Table 6 Colorful Accent 2" w:uiPriority="51"/>
-    <w:lsdException w:name="List Table 7 Colorful Accent 2" w:uiPriority="52"/>
-    <w:lsdException w:name="List Table 1 Light Accent 3" w:uiPriority="46"/>
-    <w:lsdException w:name="List Table 2 Accent 3" w:uiPriority="47"/>
-    <w:lsdException w:name="List Table 3 Accent 3" w:uiPriority="48"/>
-    <w:lsdException w:name="List Table 4 Accent 3" w:uiPriority="49"/>
-    <w:lsdException w:name="List Table 5 Dark Accent 3" w:uiPriority="50"/>
-    <w:lsdException w:name="List Table 6 Colorful Accent 3" w:uiPriority="51"/>
-    <w:lsdException w:name="List Table 7 Colorful Accent 3" w:uiPriority="52"/>
-    <w:lsdException w:name="List Table 1 Light Accent 4" w:uiPriority="46"/>
-    <w:lsdException w:name="List Table 2 Accent 4" w:uiPriority="47"/>
-    <w:lsdException w:name="List Table 3 Accent 4" w:uiPriority="48"/>
-    <w:lsdException w:name="List Table 4 Accent 4" w:uiPriority="49"/>
-    <w:lsdException w:name="List Table 5 Dark Accent 4" w:uiPriority="50"/>
-    <w:lsdException w:name="List Table 6 Colorful Accent 4" w:uiPriority="51"/>
-    <w:lsdException w:name="List Table 7 Colorful Accent 4" w:uiPriority="52"/>
-    <w:lsdException w:name="List Table 1 Light Accent 5" w:uiPriority="46"/>
-    <w:lsdException w:name="List Table 2 Accent 5" w:uiPriority="47"/>
-    <w:lsdException w:name="List Table 3 Accent 5" w:uiPriority="48"/>
-    <w:lsdException w:name="List Table 4 Accent 5" w:uiPriority="49"/>
-    <w:lsdException w:name="List Table 5 Dark Accent 5" w:uiPriority="50"/>
-    <w:lsdException w:name="List Table 6 Colorful Accent 5" w:uiPriority="51"/>
-    <w:lsdException w:name="List Table 7 Colorful Accent 5" w:uiPriority="52"/>
-    <w:lsdException w:name="List Table 1 Light Accent 6" w:uiPriority="46"/>
-    <w:lsdException w:name="List Table 2 Accent 6" w:uiPriority="47"/>
-    <w:lsdException w:name="List Table 3 Accent 6" w:uiPriority="48"/>
-    <w:lsdException w:name="List Table 4 Accent 6" w:uiPriority="49"/>
-    <w:lsdException w:name="List Table 5 Dark Accent 6" w:uiPriority="50"/>
-    <w:lsdException w:name="List Table 6 Colorful Accent 6" w:uiPriority="51"/>
-    <w:lsdException w:name="List Table 7 Colorful Accent 6" w:uiPriority="52"/>
-    <w:lsdException w:name="Mention" w:semiHidden="1" w:unhideWhenUsed="1"/>
-    <w:lsdException w:name="Smart Hyperlink" w:semiHidden="1" w:unhideWhenUsed="1"/>
-    <w:lsdException w:name="Hashtag" w:semiHidden="1" w:unhideWhenUsed="1"/>
-    <w:lsdException w:name="Unresolved Mention" w:semiHidden="1" w:unhideWhenUsed="1"/>
-    <w:lsdException w:name="Smart Link" w:semiHidden="1" w:unhideWhenUsed="1"/>
+  <w:latentStyles w:defLockedState="0" w:defUIPriority="99" w:defSemiHidden="1" w:defUnhideWhenUsed="1" w:defQFormat="0" w:count="267">
+    <w:lsdException w:name="Normal" w:semiHidden="0" w:uiPriority="0" w:unhideWhenUsed="0" w:qFormat="1"/>
+    <w:lsdException w:name="heading 1" w:semiHidden="0" w:uiPriority="9" w:unhideWhenUsed="0" w:qFormat="1"/>
+    <w:lsdException w:name="heading 2" w:uiPriority="9" w:qFormat="1"/>
+    <w:lsdException w:name="heading 3" w:uiPriority="9" w:qFormat="1"/>
+    <w:lsdException w:name="heading 4" w:uiPriority="9" w:qFormat="1"/>
+    <w:lsdException w:name="heading 5" w:uiPriority="9" w:qFormat="1"/>
+    <w:lsdException w:name="heading 6" w:uiPriority="9" w:qFormat="1"/>
+    <w:lsdException w:name="heading 7" w:uiPriority="9" w:qFormat="1"/>
+    <w:lsdException w:name="heading 8" w:uiPriority="9" w:qFormat="1"/>
+    <w:lsdException w:name="heading 9" w:uiPriority="9" w:qFormat="1"/>
+    <w:lsdException w:name="toc 1" w:uiPriority="39"/>
+    <w:lsdException w:name="toc 2" w:uiPriority="39"/>
+    <w:lsdException w:name="toc 3" w:uiPriority="39"/>
+    <w:lsdException w:name="toc 4" w:uiPriority="39"/>
+    <w:lsdException w:name="toc 5" w:uiPriority="39"/>
+    <w:lsdException w:name="toc 6" w:uiPriority="39"/>
+    <w:lsdException w:name="toc 7" w:uiPriority="39"/>
+    <w:lsdException w:name="toc 8" w:uiPriority="39"/>
+    <w:lsdException w:name="toc 9" w:uiPriority="39"/>
+    <w:lsdException w:name="caption" w:uiPriority="35" w:qFormat="1"/>
+    <w:lsdException w:name="Title" w:semiHidden="0" w:uiPriority="10" w:unhideWhenUsed="0" w:qFormat="1"/>
+    <w:lsdException w:name="Default Paragraph Font" w:uiPriority="1"/>
+    <w:lsdException w:name="Subtitle" w:semiHidden="0" w:uiPriority="11" w:unhideWhenUsed="0" w:qFormat="1"/>
+    <w:lsdException w:name="Strong" w:semiHidden="0" w:uiPriority="22" w:unhideWhenUsed="0" w:qFormat="1"/>
+    <w:lsdException w:name="Emphasis" w:semiHidden="0" w:uiPriority="20" w:unhideWhenUsed="0" w:qFormat="1"/>
+    <w:lsdException w:name="Table Grid" w:semiHidden="0" w:uiPriority="39" w:unhideWhenUsed="0"/>
+    <w:lsdException w:name="Placeholder Text" w:unhideWhenUsed="0"/>
+    <w:lsdException w:name="No Spacing" w:semiHidden="0" w:uiPriority="1" w:unhideWhenUsed="0" w:qFormat="1"/>
+    <w:lsdException w:name="Light Shading" w:semiHidden="0" w:uiPriority="60" w:unhideWhenUsed="0"/>
+    <w:lsdException w:name="Light List" w:semiHidden="0" w:uiPriority="61" w:unhideWhenUsed="0"/>
+    <w:lsdException w:name="Light Grid" w:semiHidden="0" w:uiPriority="62" w:unhideWhenUsed="0"/>
+    <w:lsdException w:name="Medium Shading 1" w:semiHidden="0" w:uiPriority="63" w:unhideWhenUsed="0"/>
+    <w:lsdException w:name="Medium Shading 2" w:semiHidden="0" w:uiPriority="64" w:unhideWhenUsed="0"/>
+    <w:lsdException w:name="Medium List 1" w:semiHidden="0" w:uiPriority="65" w:unhideWhenUsed="0"/>
+    <w:lsdException w:name="Medium List 2" w:semiHidden="0" w:uiPriority="66" w:unhideWhenUsed="0"/>
+    <w:lsdException w:name="Medium Grid 1" w:semiHidden="0" w:uiPriority="67" w:unhideWhenUsed="0"/>
+    <w:lsdException w:name="Medium Grid 2" w:semiHidden="0" w:uiPriority="68" w:unhideWhenUsed="0"/>
+    <w:lsdException w:name="Medium Grid 3" w:semiHidden="0" w:uiPriority="69" w:unhideWhenUsed="0"/>
+    <w:lsdException w:name="Dark List" w:semiHidden="0" w:uiPriority="70" w:unhideWhenUsed="0"/>
+    <w:lsdException w:name="Colorful Shading" w:semiHidden="0" w:uiPriority="71" w:unhideWhenUsed="0"/>
+    <w:lsdException w:name="Colorful List" w:semiHidden="0" w:uiPriority="72" w:unhideWhenUsed="0"/>
+    <w:lsdException w:name="Colorful Grid" w:semiHidden="0" w:uiPriority="73" w:unhideWhenUsed="0"/>
+    <w:lsdException w:name="Light Shading Accent 1" w:semiHidden="0" w:uiPriority="60" w:unhideWhenUsed="0"/>
+    <w:lsdException w:name="Light List Accent 1" w:semiHidden="0" w:uiPriority="61" w:unhideWhenUsed="0"/>
+    <w:lsdException w:name="Light Grid Accent 1" w:semiHidden="0" w:uiPriority="62" w:unhideWhenUsed="0"/>
+    <w:lsdException w:name="Medium Shading 1 Accent 1" w:semiHidden="0" w:uiPriority="63" w:unhideWhenUsed="0"/>
+    <w:lsdException w:name="Medium Shading 2 Accent 1" w:semiHidden="0" w:uiPriority="64" w:unhideWhenUsed="0"/>
+    <w:lsdException w:name="Medium List 1 Accent 1" w:semiHidden="0" w:uiPriority="65" w:unhideWhenUsed="0"/>
+    <w:lsdException w:name="Revision" w:unhideWhenUsed="0"/>
+    <w:lsdException w:name="List Paragraph" w:semiHidden="0" w:uiPriority="34" w:unhideWhenUsed="0" w:qFormat="1"/>
+    <w:lsdException w:name="Quote" w:semiHidden="0" w:uiPriority="29" w:unhideWhenUsed="0" w:qFormat="1"/>
+    <w:lsdException w:name="Intense Quote" w:semiHidden="0" w:uiPriority="30" w:unhideWhenUsed="0" w:qFormat="1"/>
+    <w:lsdException w:name="Medium List 2 Accent 1" w:semiHidden="0" w:uiPriority="66" w:unhideWhenUsed="0"/>
+    <w:lsdException w:name="Medium Grid 1 Accent 1" w:semiHidden="0" w:uiPriority="67" w:unhideWhenUsed="0"/>
+    <w:lsdException w:name="Medium Grid 2 Accent 1" w:semiHidden="0" w:uiPriority="68" w:unhideWhenUsed="0"/>
+    <w:lsdException w:name="Medium Grid 3 Accent 1" w:semiHidden="0" w:uiPriority="69" w:unhideWhenUsed="0"/>
+    <w:lsdException w:name="Dark List Accent 1" w:semiHidden="0" w:uiPriority="70" w:unhideWhenUsed="0"/>
+    <w:lsdException w:name="Colorful Shading Accent 1" w:semiHidden="0" w:uiPriority="71" w:unhideWhenUsed="0"/>
+    <w:lsdException w:name="Colorful List Accent 1" w:semiHidden="0" w:uiPriority="72" w:unhideWhenUsed="0"/>
+    <w:lsdException w:name="Colorful Grid Accent 1" w:semiHidden="0" w:uiPriority="73" w:unhideWhenUsed="0"/>
+    <w:lsdException w:name="Light Shading Accent 2" w:semiHidden="0" w:uiPriority="60" w:unhideWhenUsed="0"/>
+    <w:lsdException w:name="Light List Accent 2" w:semiHidden="0" w:uiPriority="61" w:unhideWhenUsed="0"/>
+    <w:lsdException w:name="Light Grid Accent 2" w:semiHidden="0" w:uiPriority="62" w:unhideWhenUsed="0"/>
+    <w:lsdException w:name="Medium Shading 1 Accent 2" w:semiHidden="0" w:uiPriority="63" w:unhideWhenUsed="0"/>
+    <w:lsdException w:name="Medium Shading 2 Accent 2" w:semiHidden="0" w:uiPriority="64" w:unhideWhenUsed="0"/>
+    <w:lsdException w:name="Medium List 1 Accent 2" w:semiHidden="0" w:uiPriority="65" w:unhideWhenUsed="0"/>
+    <w:lsdException w:name="Medium List 2 Accent 2" w:semiHidden="0" w:uiPriority="66" w:unhideWhenUsed="0"/>
+    <w:lsdException w:name="Medium Grid 1 Accent 2" w:semiHidden="0" w:uiPriority="67" w:unhideWhenUsed="0"/>
+    <w:lsdException w:name="Medium Grid 2 Accent 2" w:semiHidden="0" w:uiPriority="68" w:unhideWhenUsed="0"/>
+    <w:lsdException w:name="Medium Grid 3 Accent 2" w:semiHidden="0" w:uiPriority="69" w:unhideWhenUsed="0"/>
+    <w:lsdException w:name="Dark List Accent 2" w:semiHidden="0" w:uiPriority="70" w:unhideWhenUsed="0"/>
+    <w:lsdException w:name="Colorful Shading Accent 2" w:semiHidden="0" w:uiPriority="71" w:unhideWhenUsed="0"/>
+    <w:lsdException w:name="Colorful List Accent 2" w:semiHidden="0" w:uiPriority="72" w:unhideWhenUsed="0"/>
+    <w:lsdException w:name="Colorful Grid Accent 2" w:semiHidden="0" w:uiPriority="73" w:unhideWhenUsed="0"/>
+    <w:lsdException w:name="Light Shading Accent 3" w:semiHidden="0" w:uiPriority="60" w:unhideWhenUsed="0"/>
+    <w:lsdException w:name="Light List Accent 3" w:semiHidden="0" w:uiPriority="61" w:unhideWhenUsed="0"/>
+    <w:lsdException w:name="Light Grid Accent 3" w:semiHidden="0" w:uiPriority="62" w:unhideWhenUsed="0"/>
+    <w:lsdException w:name="Medium Shading 1 Accent 3" w:semiHidden="0" w:uiPriority="63" w:unhideWhenUsed="0"/>
+    <w:lsdException w:name="Medium Shading 2 Accent 3" w:semiHidden="0" w:uiPriority="64" w:unhideWhenUsed="0"/>
+    <w:lsdException w:name="Medium List 1 Accent 3" w:semiHidden="0" w:uiPriority="65" w:unhideWhenUsed="0"/>
+    <w:lsdException w:name="Medium List 2 Accent 3" w:semiHidden="0" w:uiPriority="66" w:unhideWhenUsed="0"/>
+    <w:lsdException w:name="Medium Grid 1 Accent 3" w:semiHidden="0" w:uiPriority="67" w:unhideWhenUsed="0"/>
+    <w:lsdException w:name="Medium Grid 2 Accent 3" w:semiHidden="0" w:uiPriority="68" w:unhideWhenUsed="0"/>
+    <w:lsdException w:name="Medium Grid 3 Accent 3" w:semiHidden="0" w:uiPriority="69" w:unhideWhenUsed="0"/>
+    <w:lsdException w:name="Dark List Accent 3" w:semiHidden="0" w:uiPriority="70" w:unhideWhenUsed="0"/>
+    <w:lsdException w:name="Colorful Shading Accent 3" w:semiHidden="0" w:uiPriority="71" w:unhideWhenUsed="0"/>
+    <w:lsdException w:name="Colorful List Accent 3" w:semiHidden="0" w:uiPriority="72" w:unhideWhenUsed="0"/>
+    <w:lsdException w:name="Colorful Grid Accent 3" w:semiHidden="0" w:uiPriority="73" w:unhideWhenUsed="0"/>
+    <w:lsdException w:name="Light Shading Accent 4" w:semiHidden="0" w:uiPriority="60" w:unhideWhenUsed="0"/>
+    <w:lsdException w:name="Light List Accent 4" w:semiHidden="0" w:uiPriority="61" w:unhideWhenUsed="0"/>
+    <w:lsdException w:name="Light Grid Accent 4" w:semiHidden="0" w:uiPriority="62" w:unhideWhenUsed="0"/>
+    <w:lsdException w:name="Medium Shading 1 Accent 4" w:semiHidden="0" w:uiPriority="63" w:unhideWhenUsed="0"/>
+    <w:lsdException w:name="Medium Shading 2 Accent 4" w:semiHidden="0" w:uiPriority="64" w:unhideWhenUsed="0"/>
+    <w:lsdException w:name="Medium List 1 Accent 4" w:semiHidden="0" w:uiPriority="65" w:unhideWhenUsed="0"/>
+    <w:lsdException w:name="Medium List 2 Accent 4" w:semiHidden="0" w:uiPriority="66" w:unhideWhenUsed="0"/>
+    <w:lsdException w:name="Medium Grid 1 Accent 4" w:semiHidden="0" w:uiPriority="67" w:unhideWhenUsed="0"/>
+    <w:lsdException w:name="Medium Grid 2 Accent 4" w:semiHidden="0" w:uiPriority="68" w:unhideWhenUsed="0"/>
+    <w:lsdException w:name="Medium Grid 3 Accent 4" w:semiHidden="0" w:uiPriority="69" w:unhideWhenUsed="0"/>
+    <w:lsdException w:name="Dark List Accent 4" w:semiHidden="0" w:uiPriority="70" w:unhideWhenUsed="0"/>
+    <w:lsdException w:name="Colorful Shading Accent 4" w:semiHidden="0" w:uiPriority="71" w:unhideWhenUsed="0"/>
+    <w:lsdException w:name="Colorful List Accent 4" w:semiHidden="0" w:uiPriority="72" w:unhideWhenUsed="0"/>
+    <w:lsdException w:name="Colorful Grid Accent 4" w:semiHidden="0" w:uiPriority="73" w:unhideWhenUsed="0"/>
+    <w:lsdException w:name="Light Shading Accent 5" w:semiHidden="0" w:uiPriority="60" w:unhideWhenUsed="0"/>
+    <w:lsdException w:name="Light List Accent 5" w:semiHidden="0" w:uiPriority="61" w:unhideWhenUsed="0"/>
+    <w:lsdException w:name="Light Grid Accent 5" w:semiHidden="0" w:uiPriority="62" w:unhideWhenUsed="0"/>
+    <w:lsdException w:name="Medium Shading 1 Accent 5" w:semiHidden="0" w:uiPriority="63" w:unhideWhenUsed="0"/>
+    <w:lsdException w:name="Medium Shading 2 Accent 5" w:semiHidden="0" w:uiPriority="64" w:unhideWhenUsed="0"/>
+    <w:lsdException w:name="Medium List 1 Accent 5" w:semiHidden="0" w:uiPriority="65" w:unhideWhenUsed="0"/>
+    <w:lsdException w:name="Medium List 2 Accent 5" w:semiHidden="0" w:uiPriority="66" w:unhideWhenUsed="0"/>
+    <w:lsdException w:name="Medium Grid 1 Accent 5" w:semiHidden="0" w:uiPriority="67" w:unhideWhenUsed="0"/>
+    <w:lsdException w:name="Medium Grid 2 Accent 5" w:semiHidden="0" w:uiPriority="68" w:unhideWhenUsed="0"/>
+    <w:lsdException w:name="Medium Grid 3 Accent 5" w:semiHidden="0" w:uiPriority="69" w:unhideWhenUsed="0"/>
+    <w:lsdException w:name="Dark List Accent 5" w:semiHidden="0" w:uiPriority="70" w:unhideWhenUsed="0"/>
+    <w:lsdException w:name="Colorful Shading Accent 5" w:semiHidden="0" w:uiPriority="71" w:unhideWhenUsed="0"/>
+    <w:lsdException w:name="Colorful List Accent 5" w:semiHidden="0" w:uiPriority="72" w:unhideWhenUsed="0"/>
+    <w:lsdException w:name="Colorful Grid Accent 5" w:semiHidden="0" w:uiPriority="73" w:unhideWhenUsed="0"/>
+    <w:lsdException w:name="Light Shading Accent 6" w:semiHidden="0" w:uiPriority="60" w:unhideWhenUsed="0"/>
+    <w:lsdException w:name="Light List Accent 6" w:semiHidden="0" w:uiPriority="61" w:unhideWhenUsed="0"/>
+    <w:lsdException w:name="Light Grid Accent 6" w:semiHidden="0" w:uiPriority="62" w:unhideWhenUsed="0"/>
+    <w:lsdException w:name="Medium Shading 1 Accent 6" w:semiHidden="0" w:uiPriority="63" w:unhideWhenUsed="0"/>
+    <w:lsdException w:name="Medium Shading 2 Accent 6" w:semiHidden="0" w:uiPriority="64" w:unhideWhenUsed="0"/>
+    <w:lsdException w:name="Medium List 1 Accent 6" w:semiHidden="0" w:uiPriority="65" w:unhideWhenUsed="0"/>
+    <w:lsdException w:name="Medium List 2 Accent 6" w:semiHidden="0" w:uiPriority="66" w:unhideWhenUsed="0"/>
+    <w:lsdException w:name="Medium Grid 1 Accent 6" w:semiHidden="0" w:uiPriority="67" w:unhideWhenUsed="0"/>
+    <w:lsdException w:name="Medium Grid 2 Accent 6" w:semiHidden="0" w:uiPriority="68" w:unhideWhenUsed="0"/>
+    <w:lsdException w:name="Medium Grid 3 Accent 6" w:semiHidden="0" w:uiPriority="69" w:unhideWhenUsed="0"/>
+    <w:lsdException w:name="Dark List Accent 6" w:semiHidden="0" w:uiPriority="70" w:unhideWhenUsed="0"/>
+    <w:lsdException w:name="Colorful Shading Accent 6" w:semiHidden="0" w:uiPriority="71" w:unhideWhenUsed="0"/>
+    <w:lsdException w:name="Colorful List Accent 6" w:semiHidden="0" w:uiPriority="72" w:unhideWhenUsed="0"/>
+    <w:lsdException w:name="Colorful Grid Accent 6" w:semiHidden="0" w:uiPriority="73" w:unhideWhenUsed="0"/>
+    <w:lsdException w:name="Subtle Emphasis" w:semiHidden="0" w:uiPriority="19" w:unhideWhenUsed="0" w:qFormat="1"/>
+    <w:lsdException w:name="Intense Emphasis" w:semiHidden="0" w:uiPriority="21" w:unhideWhenUsed="0" w:qFormat="1"/>
+    <w:lsdException w:name="Subtle Reference" w:semiHidden="0" w:uiPriority="31" w:unhideWhenUsed="0" w:qFormat="1"/>
+    <w:lsdException w:name="Intense Reference" w:semiHidden="0" w:uiPriority="32" w:unhideWhenUsed="0" w:qFormat="1"/>
+    <w:lsdException w:name="Book Title" w:semiHidden="0" w:uiPriority="33" w:unhideWhenUsed="0" w:qFormat="1"/>
+    <w:lsdException w:name="Bibliography" w:uiPriority="37"/>
+    <w:lsdException w:name="TOC Heading" w:uiPriority="39" w:qFormat="1"/>
   </w:latentStyles>
   <w:style w:type="paragraph" w:default="1" w:styleId="Normal">
     <w:name w:val="Normal"/>
     <w:qFormat/>
+    <w:rsid w:val="002D3A8C"/>
     <w:pPr>
       <w:spacing w:after="160" w:line="259" w:lineRule="auto"/>
     </w:pPr>
@@ -1927,6 +2013,7 @@
     <w:uiPriority w:val="99"/>
     <w:semiHidden/>
     <w:unhideWhenUsed/>
+    <w:qFormat/>
     <w:tblPr>
       <w:tblInd w:w="0" w:type="dxa"/>
       <w:tblCellMar>
@@ -1962,6 +2049,7 @@
   <w:style w:type="character" w:customStyle="1" w:styleId="ListLabel1">
     <w:name w:val="ListLabel 1"/>
     <w:qFormat/>
+    <w:rsid w:val="002D3A8C"/>
     <w:rPr>
       <w:rFonts w:cs="Courier New"/>
     </w:rPr>
@@ -1969,6 +2057,7 @@
   <w:style w:type="character" w:customStyle="1" w:styleId="ListLabel2">
     <w:name w:val="ListLabel 2"/>
     <w:qFormat/>
+    <w:rsid w:val="002D3A8C"/>
     <w:rPr>
       <w:rFonts w:cs="Courier New"/>
     </w:rPr>
@@ -1976,6 +2065,7 @@
   <w:style w:type="character" w:customStyle="1" w:styleId="ListLabel3">
     <w:name w:val="ListLabel 3"/>
     <w:qFormat/>
+    <w:rsid w:val="002D3A8C"/>
     <w:rPr>
       <w:rFonts w:cs="Courier New"/>
     </w:rPr>
@@ -1985,6 +2075,7 @@
     <w:basedOn w:val="Normal"/>
     <w:next w:val="BodyText"/>
     <w:qFormat/>
+    <w:rsid w:val="002D3A8C"/>
     <w:pPr>
       <w:keepNext/>
       <w:spacing w:before="240" w:after="120"/>
@@ -1998,6 +2089,7 @@
   <w:style w:type="paragraph" w:styleId="BodyText">
     <w:name w:val="Body Text"/>
     <w:basedOn w:val="Normal"/>
+    <w:rsid w:val="002D3A8C"/>
     <w:pPr>
       <w:spacing w:after="140" w:line="276" w:lineRule="auto"/>
     </w:pPr>
@@ -2005,6 +2097,7 @@
   <w:style w:type="paragraph" w:styleId="List">
     <w:name w:val="List"/>
     <w:basedOn w:val="BodyText"/>
+    <w:rsid w:val="002D3A8C"/>
     <w:rPr>
       <w:rFonts w:cs="Lohit Devanagari"/>
     </w:rPr>
@@ -2013,6 +2106,7 @@
     <w:name w:val="caption"/>
     <w:basedOn w:val="Normal"/>
     <w:qFormat/>
+    <w:rsid w:val="002D3A8C"/>
     <w:pPr>
       <w:suppressLineNumbers/>
       <w:spacing w:before="120" w:after="120"/>
@@ -2029,6 +2123,7 @@
     <w:name w:val="Index"/>
     <w:basedOn w:val="Normal"/>
     <w:qFormat/>
+    <w:rsid w:val="002D3A8C"/>
     <w:pPr>
       <w:suppressLineNumbers/>
     </w:pPr>
@@ -2083,6 +2178,7 @@
     <w:uiPriority w:val="39"/>
     <w:rsid w:val="00970417"/>
     <w:tblPr>
+      <w:tblInd w:w="0" w:type="dxa"/>
       <w:tblBorders>
         <w:top w:val="single" w:sz="4" w:space="0" w:color="auto"/>
         <w:left w:val="single" w:sz="4" w:space="0" w:color="auto"/>
@@ -2091,6 +2187,12 @@
         <w:insideH w:val="single" w:sz="4" w:space="0" w:color="auto"/>
         <w:insideV w:val="single" w:sz="4" w:space="0" w:color="auto"/>
       </w:tblBorders>
+      <w:tblCellMar>
+        <w:top w:w="0" w:type="dxa"/>
+        <w:left w:w="108" w:type="dxa"/>
+        <w:bottom w:w="0" w:type="dxa"/>
+        <w:right w:w="108" w:type="dxa"/>
+      </w:tblCellMar>
     </w:tblPr>
   </w:style>
 </w:styles>
@@ -2139,7 +2241,7 @@
     </a:clrScheme>
     <a:fontScheme name="Office">
       <a:majorFont>
-        <a:latin typeface="Calibri Light" panose="020F0302020204030204"/>
+        <a:latin typeface="Calibri Light"/>
         <a:ea typeface=""/>
         <a:cs typeface=""/>
         <a:font script="Jpan" typeface="游ゴシック Light"/>
@@ -2191,7 +2293,7 @@
         <a:font script="Tfng" typeface="Ebrima"/>
       </a:majorFont>
       <a:minorFont>
-        <a:latin typeface="Calibri" panose="020F0502020204030204"/>
+        <a:latin typeface="Calibri"/>
         <a:ea typeface=""/>
         <a:cs typeface=""/>
         <a:font script="Jpan" typeface="游明朝"/>
@@ -2385,7 +2487,7 @@
   <a:extraClrSchemeLst/>
   <a:extLst>
     <a:ext uri="{05A4C25C-085E-4340-85A3-A5531E510DB2}">
-      <thm15:themeFamily xmlns:thm15="http://schemas.microsoft.com/office/thememl/2012/main" name="Office Theme" id="{62F939B6-93AF-4DB8-9C6B-D6C7DFDC589F}" vid="{4A3C46E8-61CC-4603-A589-7422A47A8E4A}"/>
+      <thm15:themeFamily xmlns="" xmlns:thm15="http://schemas.microsoft.com/office/thememl/2012/main" name="Office Theme" id="{62F939B6-93AF-4DB8-9C6B-D6C7DFDC589F}" vid="{4A3C46E8-61CC-4603-A589-7422A47A8E4A}"/>
     </a:ext>
   </a:extLst>
 </a:theme>

</xml_diff>